<commit_message>
docs: SRS v1.20 —— 并入 2026-10 迭代 PRD（FR-25~36 + OBS-01），重建 docx/pdf（T01583）
</commit_message>
<xml_diff>
--- a/阳光学习能量站-需求规格说明书.docx
+++ b/阳光学习能量站-需求规格说明书.docx
@@ -21,7 +21,152 @@
         <w:rPr>
           <w:rFonts w:eastAsia="SimSun"/>
         </w:rPr>
-        <w:t>版本：v1.13　|　状态：Draft　|　日期：2026-08-17（在 v1.12 基础上：O12 功能增强——</w:t>
+        <w:t xml:space="preserve">版本：v1.20　|　状态：Draft　|　日期：2026-10-08（在 v1.19 基础上：2026-10 迭代 PRD 并入——依据 T01447 同款产品调研（《PRD-202610迭代需求》）新增 </w:t>
+      </w:r>
+      <w:r>
+        <w:rPr>
+          <w:rFonts w:eastAsia="SimSun"/>
+          <w:b/>
+        </w:rPr>
+        <w:t>FR-25~FR-36</w:t>
+      </w:r>
+      <w:r>
+        <w:rPr>
+          <w:rFonts w:eastAsia="SimSun"/>
+        </w:rPr>
+        <w:t xml:space="preserve"> 与暂缓项 OBS-01，覆盖存档安全兜底、主题商店、转盘抽奖、热力图、完成度里程碑、存钱罐、徽章倍率、动效补强、审批队列、提示音、行为标签、移动键盘；v1.19 变更记录：在 v1.13 基础上：Phase 11 落地——N1 周期模型增强：任务 </w:t>
+      </w:r>
+      <w:r>
+        <w:rPr>
+          <w:rFonts w:ascii="Courier New" w:hAnsi="Courier New" w:eastAsia="SimSun"/>
+        </w:rPr>
+        <w:t>recur</w:t>
+      </w:r>
+      <w:r>
+        <w:rPr>
+          <w:rFonts w:eastAsia="SimSun"/>
+        </w:rPr>
+        <w:t xml:space="preserve"> 枚举由 </w:t>
+      </w:r>
+      <w:r>
+        <w:rPr>
+          <w:rFonts w:ascii="Courier New" w:hAnsi="Courier New" w:eastAsia="SimSun"/>
+        </w:rPr>
+        <w:t>{once,daily}</w:t>
+      </w:r>
+      <w:r>
+        <w:rPr>
+          <w:rFonts w:eastAsia="SimSun"/>
+        </w:rPr>
+        <w:t xml:space="preserve"> 扩展为 </w:t>
+      </w:r>
+      <w:r>
+        <w:rPr>
+          <w:rFonts w:ascii="Courier New" w:hAnsi="Courier New" w:eastAsia="SimSun"/>
+        </w:rPr>
+        <w:t>{once,daily,weekly,weekdays,adhoc}</w:t>
+      </w:r>
+      <w:r>
+        <w:rPr>
+          <w:rFonts w:eastAsia="SimSun"/>
+        </w:rPr>
+        <w:t xml:space="preserve">，新增 </w:t>
+      </w:r>
+      <w:r>
+        <w:rPr>
+          <w:rFonts w:ascii="Courier New" w:hAnsi="Courier New" w:eastAsia="SimSun"/>
+        </w:rPr>
+        <w:t>RECUR_VALUES</w:t>
+      </w:r>
+      <w:r>
+        <w:rPr>
+          <w:rFonts w:eastAsia="SimSun"/>
+        </w:rPr>
+        <w:t>/</w:t>
+      </w:r>
+      <w:r>
+        <w:rPr>
+          <w:rFonts w:ascii="Courier New" w:hAnsi="Courier New" w:eastAsia="SimSun"/>
+        </w:rPr>
+        <w:t>RECUR_LABELS</w:t>
+      </w:r>
+      <w:r>
+        <w:rPr>
+          <w:rFonts w:eastAsia="SimSun"/>
+        </w:rPr>
+        <w:t xml:space="preserve"> 常量与 </w:t>
+      </w:r>
+      <w:r>
+        <w:rPr>
+          <w:rFonts w:ascii="Courier New" w:hAnsi="Courier New" w:eastAsia="SimSun"/>
+        </w:rPr>
+        <w:t>mondayStr</w:t>
+      </w:r>
+      <w:r>
+        <w:rPr>
+          <w:rFonts w:eastAsia="SimSun"/>
+        </w:rPr>
+        <w:t>/</w:t>
+      </w:r>
+      <w:r>
+        <w:rPr>
+          <w:rFonts w:ascii="Courier New" w:hAnsi="Courier New" w:eastAsia="SimSun"/>
+        </w:rPr>
+        <w:t>isWeekend</w:t>
+      </w:r>
+      <w:r>
+        <w:rPr>
+          <w:rFonts w:eastAsia="SimSun"/>
+        </w:rPr>
+        <w:t>/</w:t>
+      </w:r>
+      <w:r>
+        <w:rPr>
+          <w:rFonts w:ascii="Courier New" w:hAnsi="Courier New" w:eastAsia="SimSun"/>
+        </w:rPr>
+        <w:t>taskVisible</w:t>
+      </w:r>
+      <w:r>
+        <w:rPr>
+          <w:rFonts w:eastAsia="SimSun"/>
+        </w:rPr>
+        <w:t>/</w:t>
+      </w:r>
+      <w:r>
+        <w:rPr>
+          <w:rFonts w:ascii="Courier New" w:hAnsi="Courier New" w:eastAsia="SimSun"/>
+        </w:rPr>
+        <w:t>recurPriority</w:t>
+      </w:r>
+      <w:r>
+        <w:rPr>
+          <w:rFonts w:eastAsia="SimSun"/>
+        </w:rPr>
+        <w:t>/</w:t>
+      </w:r>
+      <w:r>
+        <w:rPr>
+          <w:rFonts w:ascii="Courier New" w:hAnsi="Courier New" w:eastAsia="SimSun"/>
+        </w:rPr>
+        <w:t>recurOptions</w:t>
+      </w:r>
+      <w:r>
+        <w:rPr>
+          <w:rFonts w:eastAsia="SimSun"/>
+        </w:rPr>
+        <w:t xml:space="preserve"> 助手，</w:t>
+      </w:r>
+      <w:r>
+        <w:rPr>
+          <w:rFonts w:ascii="Courier New" w:hAnsi="Courier New" w:eastAsia="SimSun"/>
+        </w:rPr>
+        <w:t>resetRecurringTasks</w:t>
+      </w:r>
+      <w:r>
+        <w:rPr>
+          <w:rFonts w:eastAsia="SimSun"/>
+        </w:rPr>
+        <w:t xml:space="preserve"> 按周一/工作日分键重置、</w:t>
       </w:r>
       <w:r>
         <w:rPr>
@@ -33,37 +178,13 @@
         <w:rPr>
           <w:rFonts w:eastAsia="SimSun"/>
         </w:rPr>
-        <w:t xml:space="preserve"> 今日推荐由"按 subject→unit→task 顺序取前 N"改为未完成任务附加 </w:t>
-      </w:r>
-      <w:r>
-        <w:rPr>
-          <w:rFonts w:ascii="Courier New" w:hAnsi="Courier New" w:eastAsia="SimSun"/>
-        </w:rPr>
-        <w:t>daily</w:t>
-      </w:r>
-      <w:r>
-        <w:rPr>
-          <w:rFonts w:eastAsia="SimSun"/>
-        </w:rPr>
-        <w:t xml:space="preserve"> 标记并按「daily 周期任务优先、其余保持原序」稳定排序（本应用无截止日期字段，"临期"落地为"每日必做优先"）；O17 经全文件复核确认已在 FR-16 阶段完整闭环（</w:t>
-      </w:r>
-      <w:r>
-        <w:rPr>
-          <w:rFonts w:ascii="Courier New" w:hAnsi="Courier New" w:eastAsia="SimSun"/>
-        </w:rPr>
-        <w:t>resetRecurringTasks</w:t>
-      </w:r>
-      <w:r>
-        <w:rPr>
-          <w:rFonts w:eastAsia="SimSun"/>
-        </w:rPr>
-        <w:t xml:space="preserve"> 在 </w:t>
-      </w:r>
-      <w:r>
-        <w:rPr>
-          <w:rFonts w:ascii="Courier New" w:hAnsi="Courier New" w:eastAsia="SimSun"/>
-        </w:rPr>
-        <w:t>load</w:t>
+        <w:t xml:space="preserve"> 按周期优先级排序、</w:t>
+      </w:r>
+      <w:r>
+        <w:rPr>
+          <w:rFonts w:ascii="Courier New" w:hAnsi="Courier New" w:eastAsia="SimSun"/>
+        </w:rPr>
+        <w:t>computeProgress</w:t>
       </w:r>
       <w:r>
         <w:rPr>
@@ -75,7 +196,19 @@
         <w:rPr>
           <w:rFonts w:ascii="Courier New" w:hAnsi="Courier New" w:eastAsia="SimSun"/>
         </w:rPr>
-        <w:t>doImport</w:t>
+        <w:t>renderContent</w:t>
+      </w:r>
+      <w:r>
+        <w:rPr>
+          <w:rFonts w:eastAsia="SimSun"/>
+        </w:rPr>
+        <w:t xml:space="preserve"> 过滤周末隐藏任务，</w:t>
+      </w:r>
+      <w:r>
+        <w:rPr>
+          <w:rFonts w:ascii="Courier New" w:hAnsi="Courier New" w:eastAsia="SimSun"/>
+        </w:rPr>
+        <w:t>ensureIds</w:t>
       </w:r>
       <w:r>
         <w:rPr>
@@ -87,25 +220,109 @@
         <w:rPr>
           <w:rFonts w:ascii="Courier New" w:hAnsi="Courier New" w:eastAsia="SimSun"/>
         </w:rPr>
-        <w:t>applyRemote</w:t>
-      </w:r>
-      <w:r>
-        <w:rPr>
-          <w:rFonts w:eastAsia="SimSun"/>
-        </w:rPr>
-        <w:t xml:space="preserve"> 三处触发、</w:t>
-      </w:r>
-      <w:r>
-        <w:rPr>
-          <w:rFonts w:ascii="Courier New" w:hAnsi="Courier New" w:eastAsia="SimSun"/>
-        </w:rPr>
-        <w:t>lastDailyReset</w:t>
-      </w:r>
-      <w:r>
-        <w:rPr>
-          <w:rFonts w:eastAsia="SimSun"/>
-        </w:rPr>
-        <w:t xml:space="preserve"> 持久化），原评审误列未做已更正；其余同 v1.12）</w:t>
+        <w:t>validateImport</w:t>
+      </w:r>
+      <w:r>
+        <w:rPr>
+          <w:rFonts w:eastAsia="SimSun"/>
+        </w:rPr>
+        <w:t xml:space="preserve"> 同步白名单；O9 自定义 overlay 替代：新增 </w:t>
+      </w:r>
+      <w:r>
+        <w:rPr>
+          <w:rFonts w:ascii="Courier New" w:hAnsi="Courier New" w:eastAsia="SimSun"/>
+        </w:rPr>
+        <w:t>showConfirm</w:t>
+      </w:r>
+      <w:r>
+        <w:rPr>
+          <w:rFonts w:eastAsia="SimSun"/>
+        </w:rPr>
+        <w:t>/</w:t>
+      </w:r>
+      <w:r>
+        <w:rPr>
+          <w:rFonts w:ascii="Courier New" w:hAnsi="Courier New" w:eastAsia="SimSun"/>
+        </w:rPr>
+        <w:t>showPrompt</w:t>
+      </w:r>
+      <w:r>
+        <w:rPr>
+          <w:rFonts w:eastAsia="SimSun"/>
+        </w:rPr>
+        <w:t xml:space="preserve"> Promise 助手与 </w:t>
+      </w:r>
+      <w:r>
+        <w:rPr>
+          <w:rFonts w:ascii="Courier New" w:hAnsi="Courier New" w:eastAsia="SimSun"/>
+        </w:rPr>
+        <w:t>#confirmDialog</w:t>
+      </w:r>
+      <w:r>
+        <w:rPr>
+          <w:rFonts w:eastAsia="SimSun"/>
+        </w:rPr>
+        <w:t>/</w:t>
+      </w:r>
+      <w:r>
+        <w:rPr>
+          <w:rFonts w:ascii="Courier New" w:hAnsi="Courier New" w:eastAsia="SimSun"/>
+        </w:rPr>
+        <w:t>#promptDialog</w:t>
+      </w:r>
+      <w:r>
+        <w:rPr>
+          <w:rFonts w:eastAsia="SimSun"/>
+        </w:rPr>
+        <w:t xml:space="preserve"> 浮层，原 11 处原生 </w:t>
+      </w:r>
+      <w:r>
+        <w:rPr>
+          <w:rFonts w:ascii="Courier New" w:hAnsi="Courier New" w:eastAsia="SimSun"/>
+        </w:rPr>
+        <w:t>confirm()</w:t>
+      </w:r>
+      <w:r>
+        <w:rPr>
+          <w:rFonts w:eastAsia="SimSun"/>
+        </w:rPr>
+        <w:t>/</w:t>
+      </w:r>
+      <w:r>
+        <w:rPr>
+          <w:rFonts w:ascii="Courier New" w:hAnsi="Courier New" w:eastAsia="SimSun"/>
+        </w:rPr>
+        <w:t>prompt()</w:t>
+      </w:r>
+      <w:r>
+        <w:rPr>
+          <w:rFonts w:eastAsia="SimSun"/>
+        </w:rPr>
+        <w:t xml:space="preserve"> 改走 overlay（仅保留 2 处降级兜底）；</w:t>
+      </w:r>
+      <w:r>
+        <w:rPr>
+          <w:rFonts w:ascii="Courier New" w:hAnsi="Courier New" w:eastAsia="SimSun"/>
+        </w:rPr>
+        <w:t>verify_dom_stub.js</w:t>
+      </w:r>
+      <w:r>
+        <w:rPr>
+          <w:rFonts w:eastAsia="SimSun"/>
+        </w:rPr>
+        <w:t xml:space="preserve"> 回归 219/0 全绿；Phase 12 落地——N2 图标优先儿童端：state.childMode 开关 + 家长中心「🧒 儿童大图标模式」按钮，开启后主内容视图任务渲染为大图标磁贴（学科 emoji + 标题 + 阳光），隐藏家长用周期下拉，家长端编辑器保持文字；O10 误取消撤销：取消已完成任务 −5☀️ 经 toast 撤销按钮在数秒窗口内还原完成态与阳光（手动重新勾选可防重复计分）；</w:t>
+      </w:r>
+      <w:r>
+        <w:rPr>
+          <w:rFonts w:ascii="Courier New" w:hAnsi="Courier New" w:eastAsia="SimSun"/>
+        </w:rPr>
+        <w:t>verify_dom_stub.js</w:t>
+      </w:r>
+      <w:r>
+        <w:rPr>
+          <w:rFonts w:eastAsia="SimSun"/>
+        </w:rPr>
+        <w:t xml:space="preserve"> 回归 240/0 全绿；Phase 14 G 本地周报已落地（v1.18，详见 §4.1 变更记录）；功能规格 FR-01~FR-24 不变；Phase 14 D 多人竞速已落地（v1.19，详见 §4.1 变更记录））</w:t>
         <w:br/>
         <w:t>适用范围：小学 1–6 年级本地化离线学习打卡工具（内置各年级课本样例，支持年级切换与家长审批码）</w:t>
         <w:br/>
@@ -6131,6 +6348,518 @@
       </w:r>
     </w:p>
     <w:p>
+      <w:pPr>
+        <w:pStyle w:val="Heading3"/>
+      </w:pPr>
+      <w:r>
+        <w:rPr>
+          <w:rFonts w:eastAsia="SimSun"/>
+        </w:rPr>
+        <w:t>FR-25 存档安全兜底（本地快照轮换 + 丢失恢复）　【优先级：高】</w:t>
+      </w:r>
+    </w:p>
+    <w:p>
+      <w:pPr>
+        <w:pStyle w:val="ListBullet"/>
+      </w:pPr>
+      <w:r>
+        <w:rPr>
+          <w:rFonts w:eastAsia="SimSun"/>
+          <w:b/>
+        </w:rPr>
+        <w:t>扩展 FR-09</w:t>
+      </w:r>
+      <w:r>
+        <w:rPr>
+          <w:rFonts w:eastAsia="SimSun"/>
+        </w:rPr>
+        <w:t>：FR-09 为手动全量导出/导入；FR-25 补齐「用户从未导出」时的逃生通道。详细规格见《PRD-202610迭代需求》§5 FR-25。</w:t>
+      </w:r>
+    </w:p>
+    <w:p>
+      <w:pPr>
+        <w:pStyle w:val="ListBullet"/>
+      </w:pPr>
+      <w:r>
+        <w:rPr>
+          <w:rFonts w:eastAsia="SimSun"/>
+        </w:rPr>
+        <w:t>每次写盘（防抖后）滚动快照至独立 localStorage 键（保留最近 8 份，含时间戳）；UI 如实标注快照仅同浏览器内可恢复。</w:t>
+      </w:r>
+    </w:p>
+    <w:p>
+      <w:pPr>
+        <w:pStyle w:val="ListBullet"/>
+      </w:pPr>
+      <w:r>
+        <w:rPr>
+          <w:rFonts w:eastAsia="SimSun"/>
+        </w:rPr>
+        <w:t>启动时若主存档缺失而快照存在 → 恢复面板按时间列出快照供选择，并提供「从导出文件导入」入口。</w:t>
+      </w:r>
+    </w:p>
+    <w:p>
+      <w:pPr>
+        <w:pStyle w:val="ListBullet"/>
+      </w:pPr>
+      <w:r>
+        <w:rPr>
+          <w:rFonts w:eastAsia="SimSun"/>
+        </w:rPr>
+        <w:t xml:space="preserve">导出 JSON 增加 </w:t>
+      </w:r>
+      <w:r>
+        <w:rPr>
+          <w:rFonts w:ascii="Courier New" w:hAnsi="Courier New" w:eastAsia="SimSun"/>
+        </w:rPr>
+        <w:t>meta:{version, exportedAt, childCount, checksum}</w:t>
+      </w:r>
+      <w:r>
+        <w:rPr>
+          <w:rFonts w:eastAsia="SimSun"/>
+        </w:rPr>
+        <w:t>；导入时校验，失败拒收且不破坏现有数据。</w:t>
+      </w:r>
+    </w:p>
+    <w:p>
+      <w:pPr>
+        <w:pStyle w:val="ListBullet"/>
+      </w:pPr>
+      <w:r>
+        <w:rPr>
+          <w:rFonts w:eastAsia="SimSun"/>
+        </w:rPr>
+        <w:t>连续 14 天未导出时在家长中心显示一次性提醒条（不弹窗、不通知）。</w:t>
+      </w:r>
+    </w:p>
+    <w:p>
+      <w:pPr>
+        <w:pStyle w:val="Heading3"/>
+      </w:pPr>
+      <w:r>
+        <w:rPr>
+          <w:rFonts w:eastAsia="SimSun"/>
+        </w:rPr>
+        <w:t>FR-26 主题商店（可兑换儿童主题）　【优先级：高】</w:t>
+      </w:r>
+    </w:p>
+    <w:p>
+      <w:pPr>
+        <w:pStyle w:val="ListBullet"/>
+      </w:pPr>
+      <w:r>
+        <w:rPr>
+          <w:rFonts w:eastAsia="SimSun"/>
+        </w:rPr>
+        <w:t xml:space="preserve">首批 3 套主题（海洋/森林/太空），每套为一组 CSS 变量包；沿用 FR-20 </w:t>
+      </w:r>
+      <w:r>
+        <w:rPr>
+          <w:rFonts w:ascii="Courier New" w:hAnsi="Courier New" w:eastAsia="SimSun"/>
+        </w:rPr>
+        <w:t>data-theme</w:t>
+      </w:r>
+      <w:r>
+        <w:rPr>
+          <w:rFonts w:eastAsia="SimSun"/>
+        </w:rPr>
+        <w:t xml:space="preserve"> 机制由亮/暗二态扩展为 N 态，主题包与亮/暗正交。</w:t>
+      </w:r>
+    </w:p>
+    <w:p>
+      <w:pPr>
+        <w:pStyle w:val="ListBullet"/>
+      </w:pPr>
+      <w:r>
+        <w:rPr>
+          <w:rFonts w:eastAsia="SimSun"/>
+        </w:rPr>
+        <w:t>主题作为兑换商店新品类上架（默认定价 80/120/150☀️，家长可改），兑换成功入永久库存（复用 N3 库存机制），已拥有主题可反复切换不重复扣减。</w:t>
+      </w:r>
+    </w:p>
+    <w:p>
+      <w:pPr>
+        <w:pStyle w:val="ListBullet"/>
+      </w:pPr>
+      <w:r>
+        <w:rPr>
+          <w:rFonts w:eastAsia="SimSun"/>
+        </w:rPr>
+        <w:t>三主题在暗色模式下对比度可读；主题包总增量 ≤15KB 内联。</w:t>
+      </w:r>
+    </w:p>
+    <w:p>
+      <w:pPr>
+        <w:pStyle w:val="Heading3"/>
+      </w:pPr>
+      <w:r>
+        <w:rPr>
+          <w:rFonts w:eastAsia="SimSun"/>
+        </w:rPr>
+        <w:t>FR-27 阳光转盘抽奖　【优先级：高】</w:t>
+      </w:r>
+    </w:p>
+    <w:p>
+      <w:pPr>
+        <w:pStyle w:val="ListBullet"/>
+      </w:pPr>
+      <w:r>
+        <w:rPr>
+          <w:rFonts w:eastAsia="SimSun"/>
+        </w:rPr>
+        <w:t>家长中心配置奖品池（名称/图标/概率/限购/记账型奖励），至少 2 个「谢谢参与」空奖位，概率总和 100%；单次价格可配（默认 10☀️）。</w:t>
+      </w:r>
+    </w:p>
+    <w:p>
+      <w:pPr>
+        <w:pStyle w:val="ListBullet"/>
+      </w:pPr>
+      <w:r>
+        <w:rPr>
+          <w:rFonts w:eastAsia="SimSun"/>
+        </w:rPr>
+        <w:t xml:space="preserve">抽奖即扣阳光并写流水（类型 </w:t>
+      </w:r>
+      <w:r>
+        <w:rPr>
+          <w:rFonts w:ascii="Courier New" w:hAnsi="Courier New" w:eastAsia="SimSun"/>
+        </w:rPr>
+        <w:t>lottery</w:t>
+      </w:r>
+      <w:r>
+        <w:rPr>
+          <w:rFonts w:eastAsia="SimSun"/>
+        </w:rPr>
+        <w:t>）；</w:t>
+      </w:r>
+      <w:r>
+        <w:rPr>
+          <w:rFonts w:ascii="Courier New" w:hAnsi="Courier New" w:eastAsia="SimSun"/>
+        </w:rPr>
+        <w:t>conic-gradient</w:t>
+      </w:r>
+      <w:r>
+        <w:rPr>
+          <w:rFonts w:eastAsia="SimSun"/>
+        </w:rPr>
+        <w:t xml:space="preserve"> 扇区 + 缓动停针（结果预定、动画指向），落点触发 FR-17 庆祝动效；限购耗尽奖品剔除后概率重新归一。</w:t>
+      </w:r>
+    </w:p>
+    <w:p>
+      <w:pPr>
+        <w:pStyle w:val="ListBullet"/>
+      </w:pPr>
+      <w:r>
+        <w:rPr>
+          <w:rFonts w:eastAsia="SimSun"/>
+        </w:rPr>
+        <w:t>孩子端不显示真实概率明细（仅家长中心可见）；零外部随机源、零网络。</w:t>
+      </w:r>
+    </w:p>
+    <w:p>
+      <w:pPr>
+        <w:pStyle w:val="Heading3"/>
+      </w:pPr>
+      <w:r>
+        <w:rPr>
+          <w:rFonts w:eastAsia="SimSun"/>
+        </w:rPr>
+        <w:t>FR-28 月历打卡热力图　【优先级：高】</w:t>
+      </w:r>
+    </w:p>
+    <w:p>
+      <w:pPr>
+        <w:pStyle w:val="ListBullet"/>
+      </w:pPr>
+      <w:r>
+        <w:rPr>
+          <w:rFonts w:eastAsia="SimSun"/>
+        </w:rPr>
+        <w:t>统计视图新增「本月」标签页：纯 CSS grid 月历，格子按当日完成度三档着色（0 / 有完成 / 全清），点击查看当日完成数；数据源复用打卡历史与周报日聚合，不新增存储。</w:t>
+      </w:r>
+    </w:p>
+    <w:p>
+      <w:pPr>
+        <w:pStyle w:val="Heading3"/>
+      </w:pPr>
+      <w:r>
+        <w:rPr>
+          <w:rFonts w:eastAsia="SimSun"/>
+        </w:rPr>
+        <w:t>FR-29 当日完成度里程碑奖励　【优先级：高】</w:t>
+      </w:r>
+    </w:p>
+    <w:p>
+      <w:pPr>
+        <w:pStyle w:val="ListBullet"/>
+      </w:pPr>
+      <w:r>
+        <w:rPr>
+          <w:rFonts w:eastAsia="SimSun"/>
+        </w:rPr>
+        <w:t xml:space="preserve">当日可见任务（FR-16 过滤后）完成度达 50%/75%/100% 时分别追加 +2/+5/+10☀️，每档每日仅一次，流水类型 </w:t>
+      </w:r>
+      <w:r>
+        <w:rPr>
+          <w:rFonts w:ascii="Courier New" w:hAnsi="Courier New" w:eastAsia="SimSun"/>
+        </w:rPr>
+        <w:t>milestone_daily</w:t>
+      </w:r>
+      <w:r>
+        <w:rPr>
+          <w:rFonts w:eastAsia="SimSun"/>
+        </w:rPr>
+        <w:t>；无可完成任务的当天不判定。</w:t>
+      </w:r>
+    </w:p>
+    <w:p>
+      <w:pPr>
+        <w:pStyle w:val="ListBullet"/>
+      </w:pPr>
+      <w:r>
+        <w:rPr>
+          <w:rFonts w:eastAsia="SimSun"/>
+        </w:rPr>
+        <w:t>中途跌破阈值不回收已发奖励（与 O10 撤销口径一致）。</w:t>
+      </w:r>
+    </w:p>
+    <w:p>
+      <w:pPr>
+        <w:pStyle w:val="Heading3"/>
+      </w:pPr>
+      <w:r>
+        <w:rPr>
+          <w:rFonts w:eastAsia="SimSun"/>
+        </w:rPr>
+        <w:t>FR-30 存钱罐与利息（财商）　【优先级：高】</w:t>
+      </w:r>
+    </w:p>
+    <w:p>
+      <w:pPr>
+        <w:pStyle w:val="ListBullet"/>
+      </w:pPr>
+      <w:r>
+        <w:rPr>
+          <w:rFonts w:eastAsia="SimSun"/>
+        </w:rPr>
+        <w:t xml:space="preserve">兑换商店旁新增存钱罐卡片区：阳光值可在钱包 ↔ 存钱罐间转入/转出；周利率家长可配（默认 2%，0~10%），按存入日分笔、满 7 天结算，利息写流水（类型 </w:t>
+      </w:r>
+      <w:r>
+        <w:rPr>
+          <w:rFonts w:ascii="Courier New" w:hAnsi="Courier New" w:eastAsia="SimSun"/>
+        </w:rPr>
+        <w:t>interest</w:t>
+      </w:r>
+      <w:r>
+        <w:rPr>
+          <w:rFonts w:eastAsia="SimSun"/>
+        </w:rPr>
+        <w:t>），未结算天数 UI 预估。</w:t>
+      </w:r>
+    </w:p>
+    <w:p>
+      <w:pPr>
+        <w:pStyle w:val="ListBullet"/>
+      </w:pPr>
+      <w:r>
+        <w:rPr>
+          <w:rFonts w:eastAsia="SimSun"/>
+        </w:rPr>
+        <w:t>提前取出策略可配（默认原额取出，可选扣 10% 惩罚）；纯本地时间计算，不做防作弊。</w:t>
+      </w:r>
+    </w:p>
+    <w:p>
+      <w:pPr>
+        <w:pStyle w:val="Heading3"/>
+      </w:pPr>
+      <w:r>
+        <w:rPr>
+          <w:rFonts w:eastAsia="SimSun"/>
+        </w:rPr>
+        <w:t>FR-31 成就徽章与阳光倍率　【优先级：中】</w:t>
+      </w:r>
+    </w:p>
+    <w:p>
+      <w:pPr>
+        <w:pStyle w:val="ListBullet"/>
+      </w:pPr>
+      <w:r>
+        <w:rPr>
+          <w:rFonts w:eastAsia="SimSun"/>
+        </w:rPr>
+        <w:t>首批 12 枚徽章（首周/连续 30·100 天/累计阳光 500·2000/全学科 10 任务/完成 50·200 次/兑换 10 件/首次利息结算/抽奖首中），全部基于既有数据离线聚合判定，达成自动点亮 + 庆祝动效 + 流水；重复达成不重复发奖。</w:t>
+      </w:r>
+    </w:p>
+    <w:p>
+      <w:pPr>
+        <w:pStyle w:val="ListBullet"/>
+      </w:pPr>
+      <w:r>
+        <w:rPr>
+          <w:rFonts w:eastAsia="SimSun"/>
+        </w:rPr>
+        <w:t xml:space="preserve">金级徽章 3 枚，佩戴 1 枚期间任务完成阳光 ×1.5（向下取整，仅作用任务得分，统一经 </w:t>
+      </w:r>
+      <w:r>
+        <w:rPr>
+          <w:rFonts w:ascii="Courier New" w:hAnsi="Courier New" w:eastAsia="SimSun"/>
+        </w:rPr>
+        <w:t>addSunshine</w:t>
+      </w:r>
+      <w:r>
+        <w:rPr>
+          <w:rFonts w:eastAsia="SimSun"/>
+        </w:rPr>
+        <w:t xml:space="preserve"> 单入口）；孩子端新增徽章墙视图，家长中心只读。</w:t>
+      </w:r>
+    </w:p>
+    <w:p>
+      <w:pPr>
+        <w:pStyle w:val="Heading3"/>
+      </w:pPr>
+      <w:r>
+        <w:rPr>
+          <w:rFonts w:eastAsia="SimSun"/>
+        </w:rPr>
+        <w:t>FR-32 庆祝动效补强　【优先级：中】</w:t>
+      </w:r>
+    </w:p>
+    <w:p>
+      <w:pPr>
+        <w:pStyle w:val="ListBullet"/>
+      </w:pPr>
+      <w:r>
+        <w:rPr>
+          <w:rFonts w:eastAsia="SimSun"/>
+          <w:b/>
+        </w:rPr>
+        <w:t>扩展 FR-17</w:t>
+      </w:r>
+      <w:r>
+        <w:rPr>
+          <w:rFonts w:eastAsia="SimSun"/>
+        </w:rPr>
+        <w:t>：新增「完成当日最后一个任务」触发轻量 confetti（≤30 粒，减半档）；兑换/抽奖中奖用全量档。保持 FR-17 的降级与安全约束不变。</w:t>
+      </w:r>
+    </w:p>
+    <w:p>
+      <w:pPr>
+        <w:pStyle w:val="Heading3"/>
+      </w:pPr>
+      <w:r>
+        <w:rPr>
+          <w:rFonts w:eastAsia="SimSun"/>
+        </w:rPr>
+        <w:t>FR-33 兑换待批准队列　【优先级：中】</w:t>
+      </w:r>
+    </w:p>
+    <w:p>
+      <w:pPr>
+        <w:pStyle w:val="ListBullet"/>
+      </w:pPr>
+      <w:r>
+        <w:rPr>
+          <w:rFonts w:eastAsia="SimSun"/>
+          <w:b/>
+        </w:rPr>
+        <w:t>扩展 FR-11</w:t>
+      </w:r>
+      <w:r>
+        <w:rPr>
+          <w:rFonts w:eastAsia="SimSun"/>
+        </w:rPr>
+        <w:t>（当场输码通道保留）：孩子可发起「申请兑换」进入待批准队列（不冻结阳光、不扣分不发货）；家长中心角标提示，批准走审批码确认后扣分发货，拒绝可填理由；余额不足时批准失败并回执提示；队列数据入 state 可导出迁移。</w:t>
+      </w:r>
+    </w:p>
+    <w:p>
+      <w:pPr>
+        <w:pStyle w:val="Heading3"/>
+      </w:pPr>
+      <w:r>
+        <w:rPr>
+          <w:rFonts w:eastAsia="SimSun"/>
+        </w:rPr>
+        <w:t>FR-34 完成提示音与静音开关　【优先级：中】</w:t>
+      </w:r>
+    </w:p>
+    <w:p>
+      <w:pPr>
+        <w:pStyle w:val="ListBullet"/>
+      </w:pPr>
+      <w:r>
+        <w:rPr>
+          <w:rFonts w:eastAsia="SimSun"/>
+        </w:rPr>
+        <w:t>WebAudio 振荡器合成 2 款提示音（完成=双音上行、兑换=琶音，≤400ms，零音频资源文件）；家长中心音效开/关 + 音量滑杆；默认开；无 AudioContext 环境安全跳过。</w:t>
+      </w:r>
+    </w:p>
+    <w:p>
+      <w:pPr>
+        <w:pStyle w:val="Heading3"/>
+      </w:pPr>
+      <w:r>
+        <w:rPr>
+          <w:rFonts w:eastAsia="SimSun"/>
+        </w:rPr>
+        <w:t>FR-35 行为标签　【优先级：低】</w:t>
+      </w:r>
+    </w:p>
+    <w:p>
+      <w:pPr>
+        <w:pStyle w:val="ListBullet"/>
+      </w:pPr>
+      <w:r>
+        <w:rPr>
+          <w:rFonts w:eastAsia="SimSun"/>
+        </w:rPr>
+        <w:t>任务表单新增可选标签（学习/健康/责任/生活习惯或自定义），仅用于家长统计第三维筛选与任务卡角标，不参与阳光计算；旧数据无标签导入不报错。</w:t>
+      </w:r>
+    </w:p>
+    <w:p>
+      <w:pPr>
+        <w:pStyle w:val="Heading3"/>
+      </w:pPr>
+      <w:r>
+        <w:rPr>
+          <w:rFonts w:eastAsia="SimSun"/>
+        </w:rPr>
+        <w:t>FR-36 移动端兑换数字键盘　【优先级：低】</w:t>
+      </w:r>
+    </w:p>
+    <w:p>
+      <w:pPr>
+        <w:pStyle w:val="ListBullet"/>
+      </w:pPr>
+      <w:r>
+        <w:rPr>
+          <w:rFonts w:eastAsia="SimSun"/>
+        </w:rPr>
+        <w:t>小屏（≤480px 或触屏判定）下兑换/抽奖数量输入使用大目标数字键盘（键高 ≥48px），桌面保持原生输入；仅 UI 层，不改校验逻辑。</w:t>
+      </w:r>
+    </w:p>
+    <w:p>
+      <w:pPr>
+        <w:pStyle w:val="Heading3"/>
+      </w:pPr>
+      <w:r>
+        <w:rPr>
+          <w:rFonts w:eastAsia="SimSun"/>
+        </w:rPr>
+        <w:t>OBS-01 AI 互动学习模块　【暂缓，不排期】</w:t>
+      </w:r>
+    </w:p>
+    <w:p>
+      <w:pPr>
+        <w:pStyle w:val="ListBullet"/>
+      </w:pPr>
+      <w:r>
+        <w:rPr>
+          <w:rFonts w:eastAsia="SimSun"/>
+        </w:rPr>
+        <w:t>与「本地优先、数据不出本机」红线冲突。若未来立项，硬性前提：独立可选联网模块 + 默认关闭 + 显式授权 + 最小化传输。来源与论证见《PRD-202610迭代需求》§5 OBS-01。</w:t>
+      </w:r>
+    </w:p>
+    <w:p>
       <w:r>
         <w:t>────────────────────────────</w:t>
       </w:r>
@@ -7604,6 +8333,1844 @@
           <w:rFonts w:eastAsia="SimSun"/>
         </w:rPr>
         <w:t xml:space="preserve"> 持久化），原评审误列"未做"已更正。功能规格 FR-01~FR-24 不变。</w:t>
+      </w:r>
+    </w:p>
+    <w:p>
+      <w:pPr>
+        <w:pStyle w:val="ListBullet"/>
+      </w:pPr>
+      <w:r>
+        <w:rPr>
+          <w:rFonts w:eastAsia="SimSun"/>
+          <w:b/>
+        </w:rPr>
+        <w:t>v1.14 功能增强（N1 周期模型增强 + O9 自定义 overlay 替代）</w:t>
+      </w:r>
+      <w:r>
+        <w:rPr>
+          <w:rFonts w:eastAsia="SimSun"/>
+        </w:rPr>
+        <w:t xml:space="preserve">：任务 </w:t>
+      </w:r>
+      <w:r>
+        <w:rPr>
+          <w:rFonts w:ascii="Courier New" w:hAnsi="Courier New" w:eastAsia="SimSun"/>
+        </w:rPr>
+        <w:t>recur</w:t>
+      </w:r>
+      <w:r>
+        <w:rPr>
+          <w:rFonts w:eastAsia="SimSun"/>
+        </w:rPr>
+        <w:t xml:space="preserve"> 周期枚举由 </w:t>
+      </w:r>
+      <w:r>
+        <w:rPr>
+          <w:rFonts w:ascii="Courier New" w:hAnsi="Courier New" w:eastAsia="SimSun"/>
+        </w:rPr>
+        <w:t>{once,daily}</w:t>
+      </w:r>
+      <w:r>
+        <w:rPr>
+          <w:rFonts w:eastAsia="SimSun"/>
+        </w:rPr>
+        <w:t xml:space="preserve"> 扩展为 </w:t>
+      </w:r>
+      <w:r>
+        <w:rPr>
+          <w:rFonts w:ascii="Courier New" w:hAnsi="Courier New" w:eastAsia="SimSun"/>
+        </w:rPr>
+        <w:t>{once,daily,weekly,weekdays,adhoc}</w:t>
+      </w:r>
+      <w:r>
+        <w:rPr>
+          <w:rFonts w:eastAsia="SimSun"/>
+        </w:rPr>
+        <w:t xml:space="preserve">，新增 </w:t>
+      </w:r>
+      <w:r>
+        <w:rPr>
+          <w:rFonts w:ascii="Courier New" w:hAnsi="Courier New" w:eastAsia="SimSun"/>
+        </w:rPr>
+        <w:t>RECUR_VALUES</w:t>
+      </w:r>
+      <w:r>
+        <w:rPr>
+          <w:rFonts w:eastAsia="SimSun"/>
+        </w:rPr>
+        <w:t>/</w:t>
+      </w:r>
+      <w:r>
+        <w:rPr>
+          <w:rFonts w:ascii="Courier New" w:hAnsi="Courier New" w:eastAsia="SimSun"/>
+        </w:rPr>
+        <w:t>RECUR_LABELS</w:t>
+      </w:r>
+      <w:r>
+        <w:rPr>
+          <w:rFonts w:eastAsia="SimSun"/>
+        </w:rPr>
+        <w:t xml:space="preserve"> 常量与 </w:t>
+      </w:r>
+      <w:r>
+        <w:rPr>
+          <w:rFonts w:ascii="Courier New" w:hAnsi="Courier New" w:eastAsia="SimSun"/>
+        </w:rPr>
+        <w:t>mondayStr</w:t>
+      </w:r>
+      <w:r>
+        <w:rPr>
+          <w:rFonts w:eastAsia="SimSun"/>
+        </w:rPr>
+        <w:t>/</w:t>
+      </w:r>
+      <w:r>
+        <w:rPr>
+          <w:rFonts w:ascii="Courier New" w:hAnsi="Courier New" w:eastAsia="SimSun"/>
+        </w:rPr>
+        <w:t>isWeekend</w:t>
+      </w:r>
+      <w:r>
+        <w:rPr>
+          <w:rFonts w:eastAsia="SimSun"/>
+        </w:rPr>
+        <w:t>/</w:t>
+      </w:r>
+      <w:r>
+        <w:rPr>
+          <w:rFonts w:ascii="Courier New" w:hAnsi="Courier New" w:eastAsia="SimSun"/>
+        </w:rPr>
+        <w:t>taskVisible</w:t>
+      </w:r>
+      <w:r>
+        <w:rPr>
+          <w:rFonts w:eastAsia="SimSun"/>
+        </w:rPr>
+        <w:t>/</w:t>
+      </w:r>
+      <w:r>
+        <w:rPr>
+          <w:rFonts w:ascii="Courier New" w:hAnsi="Courier New" w:eastAsia="SimSun"/>
+        </w:rPr>
+        <w:t>recurPriority</w:t>
+      </w:r>
+      <w:r>
+        <w:rPr>
+          <w:rFonts w:eastAsia="SimSun"/>
+        </w:rPr>
+        <w:t>/</w:t>
+      </w:r>
+      <w:r>
+        <w:rPr>
+          <w:rFonts w:ascii="Courier New" w:hAnsi="Courier New" w:eastAsia="SimSun"/>
+        </w:rPr>
+        <w:t>recurOptions</w:t>
+      </w:r>
+      <w:r>
+        <w:rPr>
+          <w:rFonts w:eastAsia="SimSun"/>
+        </w:rPr>
+        <w:t xml:space="preserve"> 助手；</w:t>
+      </w:r>
+      <w:r>
+        <w:rPr>
+          <w:rFonts w:ascii="Courier New" w:hAnsi="Courier New" w:eastAsia="SimSun"/>
+        </w:rPr>
+        <w:t>resetRecurringTasks</w:t>
+      </w:r>
+      <w:r>
+        <w:rPr>
+          <w:rFonts w:eastAsia="SimSun"/>
+        </w:rPr>
+        <w:t xml:space="preserve"> 按周一（weekly）/工作日（weekdays）分键重置，</w:t>
+      </w:r>
+      <w:r>
+        <w:rPr>
+          <w:rFonts w:ascii="Courier New" w:hAnsi="Courier New" w:eastAsia="SimSun"/>
+        </w:rPr>
+        <w:t>getRecommendation</w:t>
+      </w:r>
+      <w:r>
+        <w:rPr>
+          <w:rFonts w:eastAsia="SimSun"/>
+        </w:rPr>
+        <w:t xml:space="preserve"> 改用 </w:t>
+      </w:r>
+      <w:r>
+        <w:rPr>
+          <w:rFonts w:ascii="Courier New" w:hAnsi="Courier New" w:eastAsia="SimSun"/>
+        </w:rPr>
+        <w:t>recurPriority</w:t>
+      </w:r>
+      <w:r>
+        <w:rPr>
+          <w:rFonts w:eastAsia="SimSun"/>
+        </w:rPr>
+        <w:t>（daily&gt;weekdays&gt;weekly&gt;0）稳定排序，</w:t>
+      </w:r>
+      <w:r>
+        <w:rPr>
+          <w:rFonts w:ascii="Courier New" w:hAnsi="Courier New" w:eastAsia="SimSun"/>
+        </w:rPr>
+        <w:t>computeProgress</w:t>
+      </w:r>
+      <w:r>
+        <w:rPr>
+          <w:rFonts w:eastAsia="SimSun"/>
+        </w:rPr>
+        <w:t>/</w:t>
+      </w:r>
+      <w:r>
+        <w:rPr>
+          <w:rFonts w:ascii="Courier New" w:hAnsi="Courier New" w:eastAsia="SimSun"/>
+        </w:rPr>
+        <w:t>renderContent</w:t>
+      </w:r>
+      <w:r>
+        <w:rPr>
+          <w:rFonts w:eastAsia="SimSun"/>
+        </w:rPr>
+        <w:t xml:space="preserve"> 跳过周末隐藏的「工作日」任务，</w:t>
+      </w:r>
+      <w:r>
+        <w:rPr>
+          <w:rFonts w:ascii="Courier New" w:hAnsi="Courier New" w:eastAsia="SimSun"/>
+        </w:rPr>
+        <w:t>ensureIds</w:t>
+      </w:r>
+      <w:r>
+        <w:rPr>
+          <w:rFonts w:eastAsia="SimSun"/>
+        </w:rPr>
+        <w:t>/</w:t>
+      </w:r>
+      <w:r>
+        <w:rPr>
+          <w:rFonts w:ascii="Courier New" w:hAnsi="Courier New" w:eastAsia="SimSun"/>
+        </w:rPr>
+        <w:t>validateImport</w:t>
+      </w:r>
+      <w:r>
+        <w:rPr>
+          <w:rFonts w:eastAsia="SimSun"/>
+        </w:rPr>
+        <w:t xml:space="preserve"> 对 </w:t>
+      </w:r>
+      <w:r>
+        <w:rPr>
+          <w:rFonts w:ascii="Courier New" w:hAnsi="Courier New" w:eastAsia="SimSun"/>
+        </w:rPr>
+        <w:t>recur</w:t>
+      </w:r>
+      <w:r>
+        <w:rPr>
+          <w:rFonts w:eastAsia="SimSun"/>
+        </w:rPr>
+        <w:t xml:space="preserve"> 同步白名单校验；O9 新增 </w:t>
+      </w:r>
+      <w:r>
+        <w:rPr>
+          <w:rFonts w:ascii="Courier New" w:hAnsi="Courier New" w:eastAsia="SimSun"/>
+        </w:rPr>
+        <w:t>showConfirm</w:t>
+      </w:r>
+      <w:r>
+        <w:rPr>
+          <w:rFonts w:eastAsia="SimSun"/>
+        </w:rPr>
+        <w:t>/</w:t>
+      </w:r>
+      <w:r>
+        <w:rPr>
+          <w:rFonts w:ascii="Courier New" w:hAnsi="Courier New" w:eastAsia="SimSun"/>
+        </w:rPr>
+        <w:t>showPrompt</w:t>
+      </w:r>
+      <w:r>
+        <w:rPr>
+          <w:rFonts w:eastAsia="SimSun"/>
+        </w:rPr>
+        <w:t xml:space="preserve"> Promise 助手与 </w:t>
+      </w:r>
+      <w:r>
+        <w:rPr>
+          <w:rFonts w:ascii="Courier New" w:hAnsi="Courier New" w:eastAsia="SimSun"/>
+        </w:rPr>
+        <w:t>#confirmDialog</w:t>
+      </w:r>
+      <w:r>
+        <w:rPr>
+          <w:rFonts w:eastAsia="SimSun"/>
+        </w:rPr>
+        <w:t>/</w:t>
+      </w:r>
+      <w:r>
+        <w:rPr>
+          <w:rFonts w:ascii="Courier New" w:hAnsi="Courier New" w:eastAsia="SimSun"/>
+        </w:rPr>
+        <w:t>#promptDialog</w:t>
+      </w:r>
+      <w:r>
+        <w:rPr>
+          <w:rFonts w:eastAsia="SimSun"/>
+        </w:rPr>
+        <w:t xml:space="preserve"> 自定义浮层，原 11 处原生对话框改走 overlay（仅在无 Web 环境时降级到原生 </w:t>
+      </w:r>
+      <w:r>
+        <w:rPr>
+          <w:rFonts w:ascii="Courier New" w:hAnsi="Courier New" w:eastAsia="SimSun"/>
+        </w:rPr>
+        <w:t>confirm</w:t>
+      </w:r>
+      <w:r>
+        <w:rPr>
+          <w:rFonts w:eastAsia="SimSun"/>
+        </w:rPr>
+        <w:t>/</w:t>
+      </w:r>
+      <w:r>
+        <w:rPr>
+          <w:rFonts w:ascii="Courier New" w:hAnsi="Courier New" w:eastAsia="SimSun"/>
+        </w:rPr>
+        <w:t>prompt</w:t>
+      </w:r>
+      <w:r>
+        <w:rPr>
+          <w:rFonts w:eastAsia="SimSun"/>
+        </w:rPr>
+        <w:t xml:space="preserve">），UX 与整体自定义浮层风格统一。功能规格 FR-01~FR-24 不变，回归 </w:t>
+      </w:r>
+      <w:r>
+        <w:rPr>
+          <w:rFonts w:ascii="Courier New" w:hAnsi="Courier New" w:eastAsia="SimSun"/>
+        </w:rPr>
+        <w:t>verify_dom_stub.js</w:t>
+      </w:r>
+      <w:r>
+        <w:rPr>
+          <w:rFonts w:eastAsia="SimSun"/>
+        </w:rPr>
+        <w:t xml:space="preserve"> 219/0 全绿。</w:t>
+      </w:r>
+    </w:p>
+    <w:p>
+      <w:pPr>
+        <w:pStyle w:val="ListBullet"/>
+      </w:pPr>
+      <w:r>
+        <w:rPr>
+          <w:rFonts w:eastAsia="SimSun"/>
+          <w:b/>
+        </w:rPr>
+        <w:t>v1.15 功能增强（N2 图标优先儿童端 + O10 误取消撤销）</w:t>
+      </w:r>
+      <w:r>
+        <w:rPr>
+          <w:rFonts w:eastAsia="SimSun"/>
+        </w:rPr>
+        <w:t xml:space="preserve">：新增 </w:t>
+      </w:r>
+      <w:r>
+        <w:rPr>
+          <w:rFonts w:ascii="Courier New" w:hAnsi="Courier New" w:eastAsia="SimSun"/>
+        </w:rPr>
+        <w:t>state.childMode</w:t>
+      </w:r>
+      <w:r>
+        <w:rPr>
+          <w:rFonts w:eastAsia="SimSun"/>
+        </w:rPr>
+        <w:t xml:space="preserve"> 布尔开关（默认 false，确保向后兼容文字模式）与家长中心「🧒 儿童大图标模式」按钮（</w:t>
+      </w:r>
+      <w:r>
+        <w:rPr>
+          <w:rFonts w:ascii="Courier New" w:hAnsi="Courier New" w:eastAsia="SimSun"/>
+        </w:rPr>
+        <w:t>toggleChildMode</w:t>
+      </w:r>
+      <w:r>
+        <w:rPr>
+          <w:rFonts w:eastAsia="SimSun"/>
+        </w:rPr>
+        <w:t xml:space="preserve"> 切换、</w:t>
+      </w:r>
+      <w:r>
+        <w:rPr>
+          <w:rFonts w:ascii="Courier New" w:hAnsi="Courier New" w:eastAsia="SimSun"/>
+        </w:rPr>
+        <w:t>refreshChildModeBtn</w:t>
+      </w:r>
+      <w:r>
+        <w:rPr>
+          <w:rFonts w:eastAsia="SimSun"/>
+        </w:rPr>
+        <w:t xml:space="preserve"> 同步按钮文案）；开启后 </w:t>
+      </w:r>
+      <w:r>
+        <w:rPr>
+          <w:rFonts w:ascii="Courier New" w:hAnsi="Courier New" w:eastAsia="SimSun"/>
+        </w:rPr>
+        <w:t>renderContent</w:t>
+      </w:r>
+      <w:r>
+        <w:rPr>
+          <w:rFonts w:eastAsia="SimSun"/>
+        </w:rPr>
+        <w:t xml:space="preserve"> 将任务渲染为大图标磁贴（</w:t>
+      </w:r>
+      <w:r>
+        <w:rPr>
+          <w:rFonts w:ascii="Courier New" w:hAnsi="Courier New" w:eastAsia="SimSun"/>
+        </w:rPr>
+        <w:t>task-tile</w:t>
+      </w:r>
+      <w:r>
+        <w:rPr>
+          <w:rFonts w:eastAsia="SimSun"/>
+        </w:rPr>
+        <w:t xml:space="preserve">：学科 emoji + 标题 + 阳光，CSS 网格自适应），隐藏家长用的周期下拉（recur 仍仅在内容编辑器可配），家长端编辑器保持文字；O10 </w:t>
+      </w:r>
+      <w:r>
+        <w:rPr>
+          <w:rFonts w:ascii="Courier New" w:hAnsi="Courier New" w:eastAsia="SimSun"/>
+        </w:rPr>
+        <w:t>toggleTask</w:t>
+      </w:r>
+      <w:r>
+        <w:rPr>
+          <w:rFonts w:eastAsia="SimSun"/>
+        </w:rPr>
+        <w:t xml:space="preserve"> 取消已完成任务（−5☀️）时经 </w:t>
+      </w:r>
+      <w:r>
+        <w:rPr>
+          <w:rFonts w:ascii="Courier New" w:hAnsi="Courier New" w:eastAsia="SimSun"/>
+        </w:rPr>
+        <w:t>offerUndoCancel</w:t>
+      </w:r>
+      <w:r>
+        <w:rPr>
+          <w:rFonts w:eastAsia="SimSun"/>
+        </w:rPr>
+        <w:t xml:space="preserve"> 弹出来带「撤销」动作按钮的 toast（</w:t>
+      </w:r>
+      <w:r>
+        <w:rPr>
+          <w:rFonts w:ascii="Courier New" w:hAnsi="Courier New" w:eastAsia="SimSun"/>
+        </w:rPr>
+        <w:t>toast(msg, action)</w:t>
+      </w:r>
+      <w:r>
+        <w:rPr>
+          <w:rFonts w:eastAsia="SimSun"/>
+        </w:rPr>
+        <w:t xml:space="preserve"> 新增 action 参数，按钮经 </w:t>
+      </w:r>
+      <w:r>
+        <w:rPr>
+          <w:rFonts w:ascii="Courier New" w:hAnsi="Courier New" w:eastAsia="SimSun"/>
+        </w:rPr>
+        <w:t>data-act="undo-cancel"</w:t>
+      </w:r>
+      <w:r>
+        <w:rPr>
+          <w:rFonts w:eastAsia="SimSun"/>
+        </w:rPr>
+        <w:t xml:space="preserve"> 委托 DISPATCH，</w:t>
+      </w:r>
+      <w:r>
+        <w:rPr>
+          <w:rFonts w:ascii="Courier New" w:hAnsi="Courier New" w:eastAsia="SimSun"/>
+        </w:rPr>
+        <w:t>undoCancel</w:t>
+      </w:r>
+      <w:r>
+        <w:rPr>
+          <w:rFonts w:eastAsia="SimSun"/>
+        </w:rPr>
+        <w:t xml:space="preserve"> 还原完成态与阳光），手动重新勾选会清空 pending 撤销以防重复计分。回归 </w:t>
+      </w:r>
+      <w:r>
+        <w:rPr>
+          <w:rFonts w:ascii="Courier New" w:hAnsi="Courier New" w:eastAsia="SimSun"/>
+        </w:rPr>
+        <w:t>verify_dom_stub.js</w:t>
+      </w:r>
+      <w:r>
+        <w:rPr>
+          <w:rFonts w:eastAsia="SimSun"/>
+        </w:rPr>
+        <w:t xml:space="preserve"> 扩至 240/0 全绿。</w:t>
+      </w:r>
+    </w:p>
+    <w:p>
+      <w:pPr>
+        <w:pStyle w:val="ListBullet"/>
+      </w:pPr>
+      <w:r>
+        <w:rPr>
+          <w:rFonts w:eastAsia="SimSun"/>
+          <w:b/>
+        </w:rPr>
+        <w:t>v1.16 功能增强（N3 奖励库存 + N4 统计图表 + F 动效增强）</w:t>
+      </w:r>
+      <w:r>
+        <w:rPr>
+          <w:rFonts w:eastAsia="SimSun"/>
+        </w:rPr>
+        <w:t xml:space="preserve">：奖励模型新增 </w:t>
+      </w:r>
+      <w:r>
+        <w:rPr>
+          <w:rFonts w:ascii="Courier New" w:hAnsi="Courier New" w:eastAsia="SimSun"/>
+        </w:rPr>
+        <w:t>stock</w:t>
+      </w:r>
+      <w:r>
+        <w:rPr>
+          <w:rFonts w:eastAsia="SimSun"/>
+        </w:rPr>
+        <w:t xml:space="preserve"> 字段（</w:t>
+      </w:r>
+      <w:r>
+        <w:rPr>
+          <w:rFonts w:ascii="Courier New" w:hAnsi="Courier New" w:eastAsia="SimSun"/>
+        </w:rPr>
+        <w:t>number</w:t>
+      </w:r>
+      <w:r>
+        <w:rPr>
+          <w:rFonts w:eastAsia="SimSun"/>
+        </w:rPr>
+        <w:t xml:space="preserve"> 限量 / </w:t>
+      </w:r>
+      <w:r>
+        <w:rPr>
+          <w:rFonts w:ascii="Courier New" w:hAnsi="Courier New" w:eastAsia="SimSun"/>
+        </w:rPr>
+        <w:t>null</w:t>
+      </w:r>
+      <w:r>
+        <w:rPr>
+          <w:rFonts w:eastAsia="SimSun"/>
+        </w:rPr>
+        <w:t xml:space="preserve"> 不限量，向后兼容旧数据），</w:t>
+      </w:r>
+      <w:r>
+        <w:rPr>
+          <w:rFonts w:ascii="Courier New" w:hAnsi="Courier New" w:eastAsia="SimSun"/>
+        </w:rPr>
+        <w:t>ensureIds</w:t>
+      </w:r>
+      <w:r>
+        <w:rPr>
+          <w:rFonts w:eastAsia="SimSun"/>
+        </w:rPr>
+        <w:t xml:space="preserve"> 对每个 reward 归一化（缺失/非法回退 null、非负整数保留），</w:t>
+      </w:r>
+      <w:r>
+        <w:rPr>
+          <w:rFonts w:ascii="Courier New" w:hAnsi="Courier New" w:eastAsia="SimSun"/>
+        </w:rPr>
+        <w:t>renderStore</w:t>
+      </w:r>
+      <w:r>
+        <w:rPr>
+          <w:rFonts w:eastAsia="SimSun"/>
+        </w:rPr>
+        <w:t xml:space="preserve"> 显示剩余库存并在售罄（stock===0）时禁用兑换按钮，</w:t>
+      </w:r>
+      <w:r>
+        <w:rPr>
+          <w:rFonts w:ascii="Courier New" w:hAnsi="Courier New" w:eastAsia="SimSun"/>
+        </w:rPr>
+        <w:t>redeem</w:t>
+      </w:r>
+      <w:r>
+        <w:rPr>
+          <w:rFonts w:eastAsia="SimSun"/>
+        </w:rPr>
+        <w:t xml:space="preserve"> 成功且库存有限时扣减（防御售罄），</w:t>
+      </w:r>
+      <w:r>
+        <w:rPr>
+          <w:rFonts w:ascii="Courier New" w:hAnsi="Courier New" w:eastAsia="SimSun"/>
+        </w:rPr>
+        <w:t>renderEditor</w:t>
+      </w:r>
+      <w:r>
+        <w:rPr>
+          <w:rFonts w:eastAsia="SimSun"/>
+        </w:rPr>
+        <w:t xml:space="preserve"> 奖励段新增库存编辑输入、</w:t>
+      </w:r>
+      <w:r>
+        <w:rPr>
+          <w:rFonts w:ascii="Courier New" w:hAnsi="Courier New" w:eastAsia="SimSun"/>
+        </w:rPr>
+        <w:t>updateReward</w:t>
+      </w:r>
+      <w:r>
+        <w:rPr>
+          <w:rFonts w:eastAsia="SimSun"/>
+        </w:rPr>
+        <w:t xml:space="preserve"> 支持 </w:t>
+      </w:r>
+      <w:r>
+        <w:rPr>
+          <w:rFonts w:ascii="Courier New" w:hAnsi="Courier New" w:eastAsia="SimSun"/>
+        </w:rPr>
+        <w:t>stock</w:t>
+      </w:r>
+      <w:r>
+        <w:rPr>
+          <w:rFonts w:eastAsia="SimSun"/>
+        </w:rPr>
+        <w:t xml:space="preserve"> 字段（空/∞/不限→null，否则正整数）、</w:t>
+      </w:r>
+      <w:r>
+        <w:rPr>
+          <w:rFonts w:ascii="Courier New" w:hAnsi="Courier New" w:eastAsia="SimSun"/>
+        </w:rPr>
+        <w:t>change</w:t>
+      </w:r>
+      <w:r>
+        <w:rPr>
+          <w:rFonts w:eastAsia="SimSun"/>
+        </w:rPr>
+        <w:t xml:space="preserve"> 事件路由 </w:t>
+      </w:r>
+      <w:r>
+        <w:rPr>
+          <w:rFonts w:ascii="Courier New" w:hAnsi="Courier New" w:eastAsia="SimSun"/>
+        </w:rPr>
+        <w:t>rewardStock</w:t>
+      </w:r>
+      <w:r>
+        <w:rPr>
+          <w:rFonts w:eastAsia="SimSun"/>
+        </w:rPr>
+        <w:t>；家长中心新增「📊 学习统计」浮层（</w:t>
+      </w:r>
+      <w:r>
+        <w:rPr>
+          <w:rFonts w:ascii="Courier New" w:hAnsi="Courier New" w:eastAsia="SimSun"/>
+        </w:rPr>
+        <w:t>#statsDialog</w:t>
+      </w:r>
+      <w:r>
+        <w:rPr>
+          <w:rFonts w:eastAsia="SimSun"/>
+        </w:rPr>
+        <w:t xml:space="preserve"> + </w:t>
+      </w:r>
+      <w:r>
+        <w:rPr>
+          <w:rFonts w:ascii="Courier New" w:hAnsi="Courier New" w:eastAsia="SimSun"/>
+        </w:rPr>
+        <w:t>renderStats</w:t>
+      </w:r>
+      <w:r>
+        <w:rPr>
+          <w:rFonts w:eastAsia="SimSun"/>
+        </w:rPr>
+        <w:t>/</w:t>
+      </w:r>
+      <w:r>
+        <w:rPr>
+          <w:rFonts w:ascii="Courier New" w:hAnsi="Courier New" w:eastAsia="SimSun"/>
+        </w:rPr>
+        <w:t>openStats</w:t>
+      </w:r>
+      <w:r>
+        <w:rPr>
+          <w:rFonts w:eastAsia="SimSun"/>
+        </w:rPr>
+        <w:t>/</w:t>
+      </w:r>
+      <w:r>
+        <w:rPr>
+          <w:rFonts w:ascii="Courier New" w:hAnsi="Courier New" w:eastAsia="SimSun"/>
+        </w:rPr>
+        <w:t>closeStats</w:t>
+      </w:r>
+      <w:r>
+        <w:rPr>
+          <w:rFonts w:eastAsia="SimSun"/>
+        </w:rPr>
+        <w:t xml:space="preserve"> + DISPATCH </w:t>
+      </w:r>
+      <w:r>
+        <w:rPr>
+          <w:rFonts w:ascii="Courier New" w:hAnsi="Courier New" w:eastAsia="SimSun"/>
+        </w:rPr>
+        <w:t>open-stats</w:t>
+      </w:r>
+      <w:r>
+        <w:rPr>
+          <w:rFonts w:eastAsia="SimSun"/>
+        </w:rPr>
+        <w:t>/</w:t>
+      </w:r>
+      <w:r>
+        <w:rPr>
+          <w:rFonts w:ascii="Courier New" w:hAnsi="Courier New" w:eastAsia="SimSun"/>
+        </w:rPr>
+        <w:t>close-stats</w:t>
+      </w:r>
+      <w:r>
+        <w:rPr>
+          <w:rFonts w:eastAsia="SimSun"/>
+        </w:rPr>
+        <w:t>），含概览卡（阳光/等级/连续打卡/任务完成数）、各学科完成率横向条形（</w:t>
+      </w:r>
+      <w:r>
+        <w:rPr>
+          <w:rFonts w:ascii="Courier New" w:hAnsi="Courier New" w:eastAsia="SimSun"/>
+        </w:rPr>
+        <w:t>computeProgress</w:t>
+      </w:r>
+      <w:r>
+        <w:rPr>
+          <w:rFonts w:eastAsia="SimSun"/>
+        </w:rPr>
+        <w:t>）与近 7 天阳光净增减柱状图（</w:t>
+      </w:r>
+      <w:r>
+        <w:rPr>
+          <w:rFonts w:ascii="Courier New" w:hAnsi="Courier New" w:eastAsia="SimSun"/>
+        </w:rPr>
+        <w:t>computeSunTrend</w:t>
+      </w:r>
+      <w:r>
+        <w:rPr>
+          <w:rFonts w:eastAsia="SimSun"/>
+        </w:rPr>
+        <w:t xml:space="preserve"> 从 </w:t>
+      </w:r>
+      <w:r>
+        <w:rPr>
+          <w:rFonts w:ascii="Courier New" w:hAnsi="Courier New" w:eastAsia="SimSun"/>
+        </w:rPr>
+        <w:t>ledger</w:t>
+      </w:r>
+      <w:r>
+        <w:rPr>
+          <w:rFonts w:eastAsia="SimSun"/>
+        </w:rPr>
+        <w:t xml:space="preserve"> 聚合每日净额，纯 CSS 零依赖）；F 动效增强：</w:t>
+      </w:r>
+      <w:r>
+        <w:rPr>
+          <w:rFonts w:ascii="Courier New" w:hAnsi="Courier New" w:eastAsia="SimSun"/>
+        </w:rPr>
+        <w:t>addSunshine</w:t>
+      </w:r>
+      <w:r>
+        <w:rPr>
+          <w:rFonts w:eastAsia="SimSun"/>
+        </w:rPr>
+        <w:t xml:space="preserve"> 统一入口接入 </w:t>
+      </w:r>
+      <w:r>
+        <w:rPr>
+          <w:rFonts w:ascii="Courier New" w:hAnsi="Courier New" w:eastAsia="SimSun"/>
+        </w:rPr>
+        <w:t>floatSun(amount)</w:t>
+      </w:r>
+      <w:r>
+        <w:rPr>
+          <w:rFonts w:eastAsia="SimSun"/>
+        </w:rPr>
+        <w:t xml:space="preserve">（顶栏浮动 ±N☀️ 提示，非浏览器 guard）与 </w:t>
+      </w:r>
+      <w:r>
+        <w:rPr>
+          <w:rFonts w:ascii="Courier New" w:hAnsi="Courier New" w:eastAsia="SimSun"/>
+        </w:rPr>
+        <w:t>pulseTopbar()</w:t>
+      </w:r>
+      <w:r>
+        <w:rPr>
+          <w:rFonts w:eastAsia="SimSun"/>
+        </w:rPr>
+        <w:t xml:space="preserve">（顶栏 </w:t>
+      </w:r>
+      <w:r>
+        <w:rPr>
+          <w:rFonts w:ascii="Courier New" w:hAnsi="Courier New" w:eastAsia="SimSun"/>
+        </w:rPr>
+        <w:t>.stat .v</w:t>
+      </w:r>
+      <w:r>
+        <w:rPr>
+          <w:rFonts w:eastAsia="SimSun"/>
+        </w:rPr>
+        <w:t xml:space="preserve"> 跳动），每次阳光变更均有数字跳动感知，现有 confetti/celebrate 场景保留。功能规格 FR-01~FR-24 不变，回归 </w:t>
+      </w:r>
+      <w:r>
+        <w:rPr>
+          <w:rFonts w:ascii="Courier New" w:hAnsi="Courier New" w:eastAsia="SimSun"/>
+        </w:rPr>
+        <w:t>verify_dom_stub.js</w:t>
+      </w:r>
+      <w:r>
+        <w:rPr>
+          <w:rFonts w:eastAsia="SimSun"/>
+        </w:rPr>
+        <w:t xml:space="preserve"> 扩至 266/0 全绿。</w:t>
+      </w:r>
+    </w:p>
+    <w:p>
+      <w:pPr>
+        <w:pStyle w:val="ListBullet"/>
+      </w:pPr>
+      <w:r>
+        <w:rPr>
+          <w:rFonts w:eastAsia="SimSun"/>
+          <w:b/>
+        </w:rPr>
+        <w:t>v1.17 结构重构（O6 App 命名空间 / IIFE 分段）</w:t>
+      </w:r>
+      <w:r>
+        <w:rPr>
+          <w:rFonts w:eastAsia="SimSun"/>
+        </w:rPr>
+        <w:t xml:space="preserve">：单文件内联脚本整体包裹 IIFE，按模块分段（常量与配置 / 安全与加密 / 持久化 / 业务逻辑 / 渲染 / 浮层与确认输入 / 事件委托与调度 / 启动）；仅通过 </w:t>
+      </w:r>
+      <w:r>
+        <w:rPr>
+          <w:rFonts w:ascii="Courier New" w:hAnsi="Courier New" w:eastAsia="SimSun"/>
+        </w:rPr>
+        <w:t>window.__STUDY_APP__</w:t>
+      </w:r>
+      <w:r>
+        <w:rPr>
+          <w:rFonts w:eastAsia="SimSun"/>
+        </w:rPr>
+        <w:t xml:space="preserve"> 单一受控命名空间暴露接口（含 </w:t>
+      </w:r>
+      <w:r>
+        <w:rPr>
+          <w:rFonts w:ascii="Courier New" w:hAnsi="Courier New" w:eastAsia="SimSun"/>
+        </w:rPr>
+        <w:t>state</w:t>
+      </w:r>
+      <w:r>
+        <w:rPr>
+          <w:rFonts w:eastAsia="SimSun"/>
+        </w:rPr>
+        <w:t>/</w:t>
+      </w:r>
+      <w:r>
+        <w:rPr>
+          <w:rFonts w:ascii="Courier New" w:hAnsi="Courier New" w:eastAsia="SimSun"/>
+        </w:rPr>
+        <w:t>currentSubject</w:t>
+      </w:r>
+      <w:r>
+        <w:rPr>
+          <w:rFonts w:eastAsia="SimSun"/>
+        </w:rPr>
+        <w:t>/</w:t>
+      </w:r>
+      <w:r>
+        <w:rPr>
+          <w:rFonts w:ascii="Courier New" w:hAnsi="Courier New" w:eastAsia="SimSun"/>
+        </w:rPr>
+        <w:t>todayStr</w:t>
+      </w:r>
+      <w:r>
+        <w:rPr>
+          <w:rFonts w:eastAsia="SimSun"/>
+        </w:rPr>
+        <w:t xml:space="preserve"> 等可变状态的 live 访问器与其余常量/函数引用），彻底隔离全局 </w:t>
+      </w:r>
+      <w:r>
+        <w:rPr>
+          <w:rFonts w:ascii="Courier New" w:hAnsi="Courier New" w:eastAsia="SimSun"/>
+        </w:rPr>
+        <w:t>window</w:t>
+      </w:r>
+      <w:r>
+        <w:rPr>
+          <w:rFonts w:eastAsia="SimSun"/>
+        </w:rPr>
+        <w:t xml:space="preserve"> 污染；</w:t>
+      </w:r>
+      <w:r>
+        <w:rPr>
+          <w:rFonts w:ascii="Courier New" w:hAnsi="Courier New" w:eastAsia="SimSun"/>
+        </w:rPr>
+        <w:t>showConfirm</w:t>
+      </w:r>
+      <w:r>
+        <w:rPr>
+          <w:rFonts w:eastAsia="SimSun"/>
+        </w:rPr>
+        <w:t>/</w:t>
+      </w:r>
+      <w:r>
+        <w:rPr>
+          <w:rFonts w:ascii="Courier New" w:hAnsi="Courier New" w:eastAsia="SimSun"/>
+        </w:rPr>
+        <w:t>showPrompt</w:t>
+      </w:r>
+      <w:r>
+        <w:rPr>
+          <w:rFonts w:eastAsia="SimSun"/>
+        </w:rPr>
+        <w:t xml:space="preserve"> 改为优先委托 </w:t>
+      </w:r>
+      <w:r>
+        <w:rPr>
+          <w:rFonts w:ascii="Courier New" w:hAnsi="Courier New" w:eastAsia="SimSun"/>
+        </w:rPr>
+        <w:t>globalThis.__confirmHook</w:t>
+      </w:r>
+      <w:r>
+        <w:rPr>
+          <w:rFonts w:eastAsia="SimSun"/>
+        </w:rPr>
+        <w:t>/</w:t>
+      </w:r>
+      <w:r>
+        <w:rPr>
+          <w:rFonts w:ascii="Courier New" w:hAnsi="Courier New" w:eastAsia="SimSun"/>
+        </w:rPr>
+        <w:t>__promptHook</w:t>
+      </w:r>
+      <w:r>
+        <w:rPr>
+          <w:rFonts w:eastAsia="SimSun"/>
+        </w:rPr>
+        <w:t xml:space="preserve"> 钩子（测试桩经钩子注入确定性路径，浏览器无钩子时回落原自定义浮层）；回归脚本 </w:t>
+      </w:r>
+      <w:r>
+        <w:rPr>
+          <w:rFonts w:ascii="Courier New" w:hAnsi="Courier New" w:eastAsia="SimSun"/>
+        </w:rPr>
+        <w:t>verify_dom_stub.js</w:t>
+      </w:r>
+      <w:r>
+        <w:rPr>
+          <w:rFonts w:eastAsia="SimSun"/>
+        </w:rPr>
+        <w:t xml:space="preserve"> 合并 </w:t>
+      </w:r>
+      <w:r>
+        <w:rPr>
+          <w:rFonts w:ascii="Courier New" w:hAnsi="Courier New" w:eastAsia="SimSun"/>
+        </w:rPr>
+        <w:t>__STUDY_APP__</w:t>
+      </w:r>
+      <w:r>
+        <w:rPr>
+          <w:rFonts w:eastAsia="SimSun"/>
+        </w:rPr>
+        <w:t xml:space="preserve"> 后既有 </w:t>
+      </w:r>
+      <w:r>
+        <w:rPr>
+          <w:rFonts w:ascii="Courier New" w:hAnsi="Courier New" w:eastAsia="SimSun"/>
+        </w:rPr>
+        <w:t>ctx.fn()</w:t>
+      </w:r>
+      <w:r>
+        <w:rPr>
+          <w:rFonts w:eastAsia="SimSun"/>
+        </w:rPr>
+        <w:t xml:space="preserve"> 调用站点零改动，仍 </w:t>
+      </w:r>
+      <w:r>
+        <w:rPr>
+          <w:rFonts w:eastAsia="SimSun"/>
+          <w:b/>
+        </w:rPr>
+        <w:t>266 passed / 0 failed</w:t>
+      </w:r>
+      <w:r>
+        <w:rPr>
+          <w:rFonts w:eastAsia="SimSun"/>
+        </w:rPr>
+        <w:t>。功能规格 FR-01~FR-24 不变。</w:t>
+      </w:r>
+    </w:p>
+    <w:p>
+      <w:pPr>
+        <w:pStyle w:val="ListBullet"/>
+      </w:pPr>
+      <w:r>
+        <w:rPr>
+          <w:rFonts w:eastAsia="SimSun"/>
+          <w:b/>
+        </w:rPr>
+        <w:t>v1.18 功能增强（Phase 14 G 本地周报）</w:t>
+      </w:r>
+      <w:r>
+        <w:rPr>
+          <w:rFonts w:eastAsia="SimSun"/>
+        </w:rPr>
+        <w:t xml:space="preserve">：路线图条件项 Phase 14 落地 G（本地周报，替代需后端的邮件周报）。家长中心新增「📅 每周周报」按钮与 </w:t>
+      </w:r>
+      <w:r>
+        <w:rPr>
+          <w:rFonts w:ascii="Courier New" w:hAnsi="Courier New" w:eastAsia="SimSun"/>
+        </w:rPr>
+        <w:t>#weeklyReport</w:t>
+      </w:r>
+      <w:r>
+        <w:rPr>
+          <w:rFonts w:eastAsia="SimSun"/>
+        </w:rPr>
+        <w:t xml:space="preserve"> 浮层（</w:t>
+      </w:r>
+      <w:r>
+        <w:rPr>
+          <w:rFonts w:ascii="Courier New" w:hAnsi="Courier New" w:eastAsia="SimSun"/>
+        </w:rPr>
+        <w:t>openWeeklyReport</w:t>
+      </w:r>
+      <w:r>
+        <w:rPr>
+          <w:rFonts w:eastAsia="SimSun"/>
+        </w:rPr>
+        <w:t>/</w:t>
+      </w:r>
+      <w:r>
+        <w:rPr>
+          <w:rFonts w:ascii="Courier New" w:hAnsi="Courier New" w:eastAsia="SimSun"/>
+        </w:rPr>
+        <w:t>closeWeeklyReport</w:t>
+      </w:r>
+      <w:r>
+        <w:rPr>
+          <w:rFonts w:eastAsia="SimSun"/>
+        </w:rPr>
+        <w:t>/</w:t>
+      </w:r>
+      <w:r>
+        <w:rPr>
+          <w:rFonts w:ascii="Courier New" w:hAnsi="Courier New" w:eastAsia="SimSun"/>
+        </w:rPr>
+        <w:t>shiftWeekly</w:t>
+      </w:r>
+      <w:r>
+        <w:rPr>
+          <w:rFonts w:eastAsia="SimSun"/>
+        </w:rPr>
+        <w:t xml:space="preserve"> + DISPATCH </w:t>
+      </w:r>
+      <w:r>
+        <w:rPr>
+          <w:rFonts w:ascii="Courier New" w:hAnsi="Courier New" w:eastAsia="SimSun"/>
+        </w:rPr>
+        <w:t>open-weekly</w:t>
+      </w:r>
+      <w:r>
+        <w:rPr>
+          <w:rFonts w:eastAsia="SimSun"/>
+        </w:rPr>
+        <w:t>/</w:t>
+      </w:r>
+      <w:r>
+        <w:rPr>
+          <w:rFonts w:ascii="Courier New" w:hAnsi="Courier New" w:eastAsia="SimSun"/>
+        </w:rPr>
+        <w:t>close-weekly</w:t>
+      </w:r>
+      <w:r>
+        <w:rPr>
+          <w:rFonts w:eastAsia="SimSun"/>
+        </w:rPr>
+        <w:t>/</w:t>
+      </w:r>
+      <w:r>
+        <w:rPr>
+          <w:rFonts w:ascii="Courier New" w:hAnsi="Courier New" w:eastAsia="SimSun"/>
+        </w:rPr>
+        <w:t>weekly-prev</w:t>
+      </w:r>
+      <w:r>
+        <w:rPr>
+          <w:rFonts w:eastAsia="SimSun"/>
+        </w:rPr>
+        <w:t>/</w:t>
+      </w:r>
+      <w:r>
+        <w:rPr>
+          <w:rFonts w:ascii="Courier New" w:hAnsi="Courier New" w:eastAsia="SimSun"/>
+        </w:rPr>
+        <w:t>weekly-next</w:t>
+      </w:r>
+      <w:r>
+        <w:rPr>
+          <w:rFonts w:eastAsia="SimSun"/>
+        </w:rPr>
+        <w:t>/</w:t>
+      </w:r>
+      <w:r>
+        <w:rPr>
+          <w:rFonts w:ascii="Courier New" w:hAnsi="Courier New" w:eastAsia="SimSun"/>
+        </w:rPr>
+        <w:t>print-weekly</w:t>
+      </w:r>
+      <w:r>
+        <w:rPr>
+          <w:rFonts w:eastAsia="SimSun"/>
+        </w:rPr>
+        <w:t>/</w:t>
+      </w:r>
+      <w:r>
+        <w:rPr>
+          <w:rFonts w:ascii="Courier New" w:hAnsi="Courier New" w:eastAsia="SimSun"/>
+        </w:rPr>
+        <w:t>download-weekly</w:t>
+      </w:r>
+      <w:r>
+        <w:rPr>
+          <w:rFonts w:eastAsia="SimSun"/>
+        </w:rPr>
+        <w:t>），含「上周/本周」周窗导航（</w:t>
+      </w:r>
+      <w:r>
+        <w:rPr>
+          <w:rFonts w:ascii="Courier New" w:hAnsi="Courier New" w:eastAsia="SimSun"/>
+        </w:rPr>
+        <w:t>weeklyOffset</w:t>
+      </w:r>
+      <w:r>
+        <w:rPr>
+          <w:rFonts w:eastAsia="SimSun"/>
+        </w:rPr>
+        <w:t xml:space="preserve"> 钳制在 ≤0，不导航到未来周）；新增 </w:t>
+      </w:r>
+      <w:r>
+        <w:rPr>
+          <w:rFonts w:ascii="Courier New" w:hAnsi="Courier New" w:eastAsia="SimSun"/>
+        </w:rPr>
+        <w:t>weekRange</w:t>
+      </w:r>
+      <w:r>
+        <w:rPr>
+          <w:rFonts w:eastAsia="SimSun"/>
+        </w:rPr>
+        <w:t>/</w:t>
+      </w:r>
+      <w:r>
+        <w:rPr>
+          <w:rFonts w:ascii="Courier New" w:hAnsi="Courier New" w:eastAsia="SimSun"/>
+        </w:rPr>
+        <w:t>weekKeyRange</w:t>
+      </w:r>
+      <w:r>
+        <w:rPr>
+          <w:rFonts w:eastAsia="SimSun"/>
+        </w:rPr>
+        <w:t>（以周一为起点导出本地周区间与日键）、</w:t>
+      </w:r>
+      <w:r>
+        <w:rPr>
+          <w:rFonts w:ascii="Courier New" w:hAnsi="Courier New" w:eastAsia="SimSun"/>
+        </w:rPr>
+        <w:t>computeWeekly(c, offset)</w:t>
+      </w:r>
+      <w:r>
+        <w:rPr>
+          <w:rFonts w:eastAsia="SimSun"/>
+        </w:rPr>
+        <w:t xml:space="preserve">（按 </w:t>
+      </w:r>
+      <w:r>
+        <w:rPr>
+          <w:rFonts w:ascii="Courier New" w:hAnsi="Courier New" w:eastAsia="SimSun"/>
+        </w:rPr>
+        <w:t>c.ledger</w:t>
+      </w:r>
+      <w:r>
+        <w:rPr>
+          <w:rFonts w:eastAsia="SimSun"/>
+        </w:rPr>
+        <w:t xml:space="preserve"> 落在周窗内的条目聚合本周净增/赚取/兑出 + 按 </w:t>
+      </w:r>
+      <w:r>
+        <w:rPr>
+          <w:rFonts w:ascii="Courier New" w:hAnsi="Courier New" w:eastAsia="SimSun"/>
+        </w:rPr>
+        <w:t>type</w:t>
+      </w:r>
+      <w:r>
+        <w:rPr>
+          <w:rFonts w:eastAsia="SimSun"/>
+        </w:rPr>
+        <w:t xml:space="preserve"> 明细 + 任务完成快照 </w:t>
+      </w:r>
+      <w:r>
+        <w:rPr>
+          <w:rFonts w:ascii="Courier New" w:hAnsi="Courier New" w:eastAsia="SimSun"/>
+        </w:rPr>
+        <w:t>done/total</w:t>
+      </w:r>
+      <w:r>
+        <w:rPr>
+          <w:rFonts w:eastAsia="SimSun"/>
+        </w:rPr>
+        <w:t>）、</w:t>
+      </w:r>
+      <w:r>
+        <w:rPr>
+          <w:rFonts w:ascii="Courier New" w:hAnsi="Courier New" w:eastAsia="SimSun"/>
+        </w:rPr>
+        <w:t>typeLabel</w:t>
+      </w:r>
+      <w:r>
+        <w:rPr>
+          <w:rFonts w:eastAsia="SimSun"/>
+        </w:rPr>
+        <w:t>；</w:t>
+      </w:r>
+      <w:r>
+        <w:rPr>
+          <w:rFonts w:ascii="Courier New" w:hAnsi="Courier New" w:eastAsia="SimSun"/>
+        </w:rPr>
+        <w:t>buildWeeklyHTML()</w:t>
+      </w:r>
+      <w:r>
+        <w:rPr>
+          <w:rFonts w:eastAsia="SimSun"/>
+        </w:rPr>
+        <w:t xml:space="preserve"> 统一屏显/打印/下载三端渲染（遍历 </w:t>
+      </w:r>
+      <w:r>
+        <w:rPr>
+          <w:rFonts w:ascii="Courier New" w:hAnsi="Courier New" w:eastAsia="SimSun"/>
+        </w:rPr>
+        <w:t>state.children</w:t>
+      </w:r>
+      <w:r>
+        <w:rPr>
+          <w:rFonts w:eastAsia="SimSun"/>
+        </w:rPr>
+        <w:t xml:space="preserve"> 输出每个孩子卡片，复用 </w:t>
+      </w:r>
+      <w:r>
+        <w:rPr>
+          <w:rFonts w:ascii="Courier New" w:hAnsi="Courier New" w:eastAsia="SimSun"/>
+        </w:rPr>
+        <w:t>.stat-cards</w:t>
+      </w:r>
+      <w:r>
+        <w:rPr>
+          <w:rFonts w:eastAsia="SimSun"/>
+        </w:rPr>
+        <w:t>/</w:t>
+      </w:r>
+      <w:r>
+        <w:rPr>
+          <w:rFonts w:ascii="Courier New" w:hAnsi="Courier New" w:eastAsia="SimSun"/>
+        </w:rPr>
+        <w:t>.stat-card</w:t>
+      </w:r>
+      <w:r>
+        <w:rPr>
+          <w:rFonts w:eastAsia="SimSun"/>
+        </w:rPr>
+        <w:t>/</w:t>
+      </w:r>
+      <w:r>
+        <w:rPr>
+          <w:rFonts w:ascii="Courier New" w:hAnsi="Courier New" w:eastAsia="SimSun"/>
+        </w:rPr>
+        <w:t>.hint</w:t>
+      </w:r>
+      <w:r>
+        <w:rPr>
+          <w:rFonts w:eastAsia="SimSun"/>
+        </w:rPr>
+        <w:t>/</w:t>
+      </w:r>
+      <w:r>
+        <w:rPr>
+          <w:rFonts w:ascii="Courier New" w:hAnsi="Courier New" w:eastAsia="SimSun"/>
+        </w:rPr>
+        <w:t>.prow</w:t>
+      </w:r>
+      <w:r>
+        <w:rPr>
+          <w:rFonts w:eastAsia="SimSun"/>
+        </w:rPr>
+        <w:t>），</w:t>
+      </w:r>
+      <w:r>
+        <w:rPr>
+          <w:rFonts w:ascii="Courier New" w:hAnsi="Courier New" w:eastAsia="SimSun"/>
+        </w:rPr>
+        <w:t>printWeekly()</w:t>
+      </w:r>
+      <w:r>
+        <w:rPr>
+          <w:rFonts w:eastAsia="SimSun"/>
+        </w:rPr>
+        <w:t xml:space="preserve"> 复用 </w:t>
+      </w:r>
+      <w:r>
+        <w:rPr>
+          <w:rFonts w:ascii="Courier New" w:hAnsi="Courier New" w:eastAsia="SimSun"/>
+        </w:rPr>
+        <w:t>window.print()</w:t>
+      </w:r>
+      <w:r>
+        <w:rPr>
+          <w:rFonts w:eastAsia="SimSun"/>
+        </w:rPr>
+        <w:t>、</w:t>
+      </w:r>
+      <w:r>
+        <w:rPr>
+          <w:rFonts w:ascii="Courier New" w:hAnsi="Courier New" w:eastAsia="SimSun"/>
+        </w:rPr>
+        <w:t>downloadWeeklyReport()</w:t>
+      </w:r>
+      <w:r>
+        <w:rPr>
+          <w:rFonts w:eastAsia="SimSun"/>
+        </w:rPr>
+        <w:t xml:space="preserve"> 仅浏览器触发 Blob 下载（非浏览器安全返回 HTML 不抛错）。功能规格 FR-01~FR-24 不变，回归 </w:t>
+      </w:r>
+      <w:r>
+        <w:rPr>
+          <w:rFonts w:ascii="Courier New" w:hAnsi="Courier New" w:eastAsia="SimSun"/>
+        </w:rPr>
+        <w:t>verify_dom_stub.js</w:t>
+      </w:r>
+      <w:r>
+        <w:rPr>
+          <w:rFonts w:eastAsia="SimSun"/>
+        </w:rPr>
+        <w:t xml:space="preserve"> 扩至 290/0 全绿。</w:t>
+      </w:r>
+    </w:p>
+    <w:p>
+      <w:pPr>
+        <w:pStyle w:val="ListBullet"/>
+      </w:pPr>
+      <w:r>
+        <w:rPr>
+          <w:rFonts w:eastAsia="SimSun"/>
+          <w:b/>
+        </w:rPr>
+        <w:t>v1.19 功能增强（Phase 14 D 多人竞速）</w:t>
+      </w:r>
+      <w:r>
+        <w:rPr>
+          <w:rFonts w:eastAsia="SimSun"/>
+        </w:rPr>
+        <w:t xml:space="preserve">：路线图最后一个条件项 Phase 14 落地 D（多人竞速 / 同屏多孩专注挑战赛，离线优先）。家长中心新增「🏁 专注挑战赛」按钮与 </w:t>
+      </w:r>
+      <w:r>
+        <w:rPr>
+          <w:rFonts w:ascii="Courier New" w:hAnsi="Courier New" w:eastAsia="SimSun"/>
+        </w:rPr>
+        <w:t>#raceDialog</w:t>
+      </w:r>
+      <w:r>
+        <w:rPr>
+          <w:rFonts w:eastAsia="SimSun"/>
+        </w:rPr>
+        <w:t xml:space="preserve"> 浮层（</w:t>
+      </w:r>
+      <w:r>
+        <w:rPr>
+          <w:rFonts w:ascii="Courier New" w:hAnsi="Courier New" w:eastAsia="SimSun"/>
+        </w:rPr>
+        <w:t>openRaceDialog</w:t>
+      </w:r>
+      <w:r>
+        <w:rPr>
+          <w:rFonts w:eastAsia="SimSun"/>
+        </w:rPr>
+        <w:t>/</w:t>
+      </w:r>
+      <w:r>
+        <w:rPr>
+          <w:rFonts w:ascii="Courier New" w:hAnsi="Courier New" w:eastAsia="SimSun"/>
+        </w:rPr>
+        <w:t>closeRaceDialog</w:t>
+      </w:r>
+      <w:r>
+        <w:rPr>
+          <w:rFonts w:eastAsia="SimSun"/>
+        </w:rPr>
+        <w:t xml:space="preserve"> + DISPATCH </w:t>
+      </w:r>
+      <w:r>
+        <w:rPr>
+          <w:rFonts w:ascii="Courier New" w:hAnsi="Courier New" w:eastAsia="SimSun"/>
+        </w:rPr>
+        <w:t>open-race</w:t>
+      </w:r>
+      <w:r>
+        <w:rPr>
+          <w:rFonts w:eastAsia="SimSun"/>
+        </w:rPr>
+        <w:t>/</w:t>
+      </w:r>
+      <w:r>
+        <w:rPr>
+          <w:rFonts w:ascii="Courier New" w:hAnsi="Courier New" w:eastAsia="SimSun"/>
+        </w:rPr>
+        <w:t>close-race</w:t>
+      </w:r>
+      <w:r>
+        <w:rPr>
+          <w:rFonts w:eastAsia="SimSun"/>
+        </w:rPr>
+        <w:t>/</w:t>
+      </w:r>
+      <w:r>
+        <w:rPr>
+          <w:rFonts w:ascii="Courier New" w:hAnsi="Courier New" w:eastAsia="SimSun"/>
+        </w:rPr>
+        <w:t>race-dur</w:t>
+      </w:r>
+      <w:r>
+        <w:rPr>
+          <w:rFonts w:eastAsia="SimSun"/>
+        </w:rPr>
+        <w:t>/</w:t>
+      </w:r>
+      <w:r>
+        <w:rPr>
+          <w:rFonts w:ascii="Courier New" w:hAnsi="Courier New" w:eastAsia="SimSun"/>
+        </w:rPr>
+        <w:t>race-toggle</w:t>
+      </w:r>
+      <w:r>
+        <w:rPr>
+          <w:rFonts w:eastAsia="SimSun"/>
+        </w:rPr>
+        <w:t>/</w:t>
+      </w:r>
+      <w:r>
+        <w:rPr>
+          <w:rFonts w:ascii="Courier New" w:hAnsi="Courier New" w:eastAsia="SimSun"/>
+        </w:rPr>
+        <w:t>race-start</w:t>
+      </w:r>
+      <w:r>
+        <w:rPr>
+          <w:rFonts w:eastAsia="SimSun"/>
+        </w:rPr>
+        <w:t>/</w:t>
+      </w:r>
+      <w:r>
+        <w:rPr>
+          <w:rFonts w:ascii="Courier New" w:hAnsi="Courier New" w:eastAsia="SimSun"/>
+        </w:rPr>
+        <w:t>race-finish</w:t>
+      </w:r>
+      <w:r>
+        <w:rPr>
+          <w:rFonts w:eastAsia="SimSun"/>
+        </w:rPr>
+        <w:t>/</w:t>
+      </w:r>
+      <w:r>
+        <w:rPr>
+          <w:rFonts w:ascii="Courier New" w:hAnsi="Courier New" w:eastAsia="SimSun"/>
+        </w:rPr>
+        <w:t>race-end</w:t>
+      </w:r>
+      <w:r>
+        <w:rPr>
+          <w:rFonts w:eastAsia="SimSun"/>
+        </w:rPr>
+        <w:t>/</w:t>
+      </w:r>
+      <w:r>
+        <w:rPr>
+          <w:rFonts w:ascii="Courier New" w:hAnsi="Courier New" w:eastAsia="SimSun"/>
+        </w:rPr>
+        <w:t>race-again</w:t>
+      </w:r>
+      <w:r>
+        <w:rPr>
+          <w:rFonts w:eastAsia="SimSun"/>
+        </w:rPr>
+        <w:t xml:space="preserve">）；模块级 </w:t>
+      </w:r>
+      <w:r>
+        <w:rPr>
+          <w:rFonts w:ascii="Courier New" w:hAnsi="Courier New" w:eastAsia="SimSun"/>
+        </w:rPr>
+        <w:t>var raceState</w:t>
+      </w:r>
+      <w:r>
+        <w:rPr>
+          <w:rFonts w:eastAsia="SimSun"/>
+        </w:rPr>
+        <w:t>（稳定对象引用，</w:t>
+      </w:r>
+      <w:r>
+        <w:rPr>
+          <w:rFonts w:ascii="Courier New" w:hAnsi="Courier New" w:eastAsia="SimSun"/>
+        </w:rPr>
+        <w:t>phase∈{setup,running,result}</w:t>
+      </w:r>
+      <w:r>
+        <w:rPr>
+          <w:rFonts w:eastAsia="SimSun"/>
+        </w:rPr>
+        <w:t>、</w:t>
+      </w:r>
+      <w:r>
+        <w:rPr>
+          <w:rFonts w:ascii="Courier New" w:hAnsi="Courier New" w:eastAsia="SimSun"/>
+        </w:rPr>
+        <w:t>durationSec</w:t>
+      </w:r>
+      <w:r>
+        <w:rPr>
+          <w:rFonts w:eastAsia="SimSun"/>
+        </w:rPr>
+        <w:t xml:space="preserve"> 可选 300/600/900、参与孩子 </w:t>
+      </w:r>
+      <w:r>
+        <w:rPr>
+          <w:rFonts w:ascii="Courier New" w:hAnsi="Courier New" w:eastAsia="SimSun"/>
+        </w:rPr>
+        <w:t>participants[]</w:t>
+      </w:r>
+      <w:r>
+        <w:rPr>
+          <w:rFonts w:eastAsia="SimSun"/>
+        </w:rPr>
+        <w:t xml:space="preserve">、完成用时 </w:t>
+      </w:r>
+      <w:r>
+        <w:rPr>
+          <w:rFonts w:ascii="Courier New" w:hAnsi="Courier New" w:eastAsia="SimSun"/>
+        </w:rPr>
+        <w:t>finishes{}</w:t>
+      </w:r>
+      <w:r>
+        <w:rPr>
+          <w:rFonts w:eastAsia="SimSun"/>
+        </w:rPr>
+        <w:t>、</w:t>
+      </w:r>
+      <w:r>
+        <w:rPr>
+          <w:rFonts w:ascii="Courier New" w:hAnsi="Courier New" w:eastAsia="SimSun"/>
+        </w:rPr>
+        <w:t>lastSummary</w:t>
+      </w:r>
+      <w:r>
+        <w:rPr>
+          <w:rFonts w:eastAsia="SimSun"/>
+        </w:rPr>
+        <w:t xml:space="preserve"> 结算快照）与常量 </w:t>
+      </w:r>
+      <w:r>
+        <w:rPr>
+          <w:rFonts w:ascii="Courier New" w:hAnsi="Courier New" w:eastAsia="SimSun"/>
+        </w:rPr>
+        <w:t>RACE_REWARD=20</w:t>
+      </w:r>
+      <w:r>
+        <w:rPr>
+          <w:rFonts w:eastAsia="SimSun"/>
+        </w:rPr>
+        <w:t>；</w:t>
+      </w:r>
+      <w:r>
+        <w:rPr>
+          <w:rFonts w:ascii="Courier New" w:hAnsi="Courier New" w:eastAsia="SimSun"/>
+        </w:rPr>
+        <w:t>selectRaceDuration</w:t>
+      </w:r>
+      <w:r>
+        <w:rPr>
+          <w:rFonts w:eastAsia="SimSun"/>
+        </w:rPr>
+        <w:t xml:space="preserve">（仅 setup 可调、运行中锁定）/ </w:t>
+      </w:r>
+      <w:r>
+        <w:rPr>
+          <w:rFonts w:ascii="Courier New" w:hAnsi="Courier New" w:eastAsia="SimSun"/>
+        </w:rPr>
+        <w:t>toggleRaceParticipant</w:t>
+      </w:r>
+      <w:r>
+        <w:rPr>
+          <w:rFonts w:eastAsia="SimSun"/>
+        </w:rPr>
+        <w:t xml:space="preserve">（点击切换参赛孩子）/ </w:t>
+      </w:r>
+      <w:r>
+        <w:rPr>
+          <w:rFonts w:ascii="Courier New" w:hAnsi="Courier New" w:eastAsia="SimSun"/>
+        </w:rPr>
+        <w:t>startRace</w:t>
+      </w:r>
+      <w:r>
+        <w:rPr>
+          <w:rFonts w:eastAsia="SimSun"/>
+        </w:rPr>
+        <w:t xml:space="preserve">（校验至少 1 位参赛、记 </w:t>
+      </w:r>
+      <w:r>
+        <w:rPr>
+          <w:rFonts w:ascii="Courier New" w:hAnsi="Courier New" w:eastAsia="SimSun"/>
+        </w:rPr>
+        <w:t>startTime</w:t>
+      </w:r>
+      <w:r>
+        <w:rPr>
+          <w:rFonts w:eastAsia="SimSun"/>
+        </w:rPr>
+        <w:t xml:space="preserve">、浏览器内 </w:t>
+      </w:r>
+      <w:r>
+        <w:rPr>
+          <w:rFonts w:ascii="Courier New" w:hAnsi="Courier New" w:eastAsia="SimSun"/>
+        </w:rPr>
+        <w:t>setInterval</w:t>
+      </w:r>
+      <w:r>
+        <w:rPr>
+          <w:rFonts w:eastAsia="SimSun"/>
+        </w:rPr>
+        <w:t xml:space="preserve"> 每 250ms 刷新倒计时，非浏览器安全）/ </w:t>
+      </w:r>
+      <w:r>
+        <w:rPr>
+          <w:rFonts w:ascii="Courier New" w:hAnsi="Courier New" w:eastAsia="SimSun"/>
+        </w:rPr>
+        <w:t>finishRaceChild</w:t>
+      </w:r>
+      <w:r>
+        <w:rPr>
+          <w:rFonts w:eastAsia="SimSun"/>
+        </w:rPr>
+        <w:t xml:space="preserve">（记录 </w:t>
+      </w:r>
+      <w:r>
+        <w:rPr>
+          <w:rFonts w:ascii="Courier New" w:hAnsi="Courier New" w:eastAsia="SimSun"/>
+        </w:rPr>
+        <w:t>elapsedMs</w:t>
+      </w:r>
+      <w:r>
+        <w:rPr>
+          <w:rFonts w:eastAsia="SimSun"/>
+        </w:rPr>
+        <w:t xml:space="preserve"> 并钳制 ≤ 时长、全员完成自动 </w:t>
+      </w:r>
+      <w:r>
+        <w:rPr>
+          <w:rFonts w:ascii="Courier New" w:hAnsi="Courier New" w:eastAsia="SimSun"/>
+        </w:rPr>
+        <w:t>endRace</w:t>
+      </w:r>
+      <w:r>
+        <w:rPr>
+          <w:rFonts w:eastAsia="SimSun"/>
+        </w:rPr>
+        <w:t xml:space="preserve">）/ </w:t>
+      </w:r>
+      <w:r>
+        <w:rPr>
+          <w:rFonts w:ascii="Courier New" w:hAnsi="Courier New" w:eastAsia="SimSun"/>
+        </w:rPr>
+        <w:t>raceRanking</w:t>
+      </w:r>
+      <w:r>
+        <w:rPr>
+          <w:rFonts w:eastAsia="SimSun"/>
+        </w:rPr>
+        <w:t xml:space="preserve">（完成者优先、用时短者排前）/ </w:t>
+      </w:r>
+      <w:r>
+        <w:rPr>
+          <w:rFonts w:ascii="Courier New" w:hAnsi="Courier New" w:eastAsia="SimSun"/>
+        </w:rPr>
+        <w:t>endRace</w:t>
+      </w:r>
+      <w:r>
+        <w:rPr>
+          <w:rFonts w:eastAsia="SimSun"/>
+        </w:rPr>
+        <w:t xml:space="preserve">（结算：完成者各 +20☀️ 经新增 </w:t>
+      </w:r>
+      <w:r>
+        <w:rPr>
+          <w:rFonts w:ascii="Courier New" w:hAnsi="Courier New" w:eastAsia="SimSun"/>
+        </w:rPr>
+        <w:t>awardSunshineTo(child,...)</w:t>
+      </w:r>
+      <w:r>
+        <w:rPr>
+          <w:rFonts w:eastAsia="SimSun"/>
+        </w:rPr>
+        <w:t xml:space="preserve"> 按孩子独立记账、按 </w:t>
+      </w:r>
+      <w:r>
+        <w:rPr>
+          <w:rFonts w:ascii="Courier New" w:hAnsi="Courier New" w:eastAsia="SimSun"/>
+        </w:rPr>
+        <w:t>durationSec</w:t>
+      </w:r>
+      <w:r>
+        <w:rPr>
+          <w:rFonts w:eastAsia="SimSun"/>
+        </w:rPr>
+        <w:t xml:space="preserve"> 桶刷新 </w:t>
+      </w:r>
+      <w:r>
+        <w:rPr>
+          <w:rFonts w:ascii="Courier New" w:hAnsi="Courier New" w:eastAsia="SimSun"/>
+        </w:rPr>
+        <w:t>child.raceBest</w:t>
+      </w:r>
+      <w:r>
+        <w:rPr>
+          <w:rFonts w:eastAsia="SimSun"/>
+        </w:rPr>
+        <w:t xml:space="preserve"> 个人最佳并标注 🏆新纪录、</w:t>
+      </w:r>
+      <w:r>
+        <w:rPr>
+          <w:rFonts w:ascii="Courier New" w:hAnsi="Courier New" w:eastAsia="SimSun"/>
+        </w:rPr>
+        <w:t>save</w:t>
+      </w:r>
+      <w:r>
+        <w:rPr>
+          <w:rFonts w:eastAsia="SimSun"/>
+        </w:rPr>
+        <w:t xml:space="preserve"> 持久化）/ </w:t>
+      </w:r>
+      <w:r>
+        <w:rPr>
+          <w:rFonts w:ascii="Courier New" w:hAnsi="Courier New" w:eastAsia="SimSun"/>
+        </w:rPr>
+        <w:t>fmtMs</w:t>
+      </w:r>
+      <w:r>
+        <w:rPr>
+          <w:rFonts w:eastAsia="SimSun"/>
+        </w:rPr>
+        <w:t>；</w:t>
+      </w:r>
+      <w:r>
+        <w:rPr>
+          <w:rFonts w:ascii="Courier New" w:hAnsi="Courier New" w:eastAsia="SimSun"/>
+        </w:rPr>
+        <w:t>buildRaceSetupHTML</w:t>
+      </w:r>
+      <w:r>
+        <w:rPr>
+          <w:rFonts w:eastAsia="SimSun"/>
+        </w:rPr>
+        <w:t>/</w:t>
+      </w:r>
+      <w:r>
+        <w:rPr>
+          <w:rFonts w:ascii="Courier New" w:hAnsi="Courier New" w:eastAsia="SimSun"/>
+        </w:rPr>
+        <w:t>buildRaceRunningHTML</w:t>
+      </w:r>
+      <w:r>
+        <w:rPr>
+          <w:rFonts w:eastAsia="SimSun"/>
+        </w:rPr>
+        <w:t>/</w:t>
+      </w:r>
+      <w:r>
+        <w:rPr>
+          <w:rFonts w:ascii="Courier New" w:hAnsi="Courier New" w:eastAsia="SimSun"/>
+        </w:rPr>
+        <w:t>buildRaceResultHTML</w:t>
+      </w:r>
+      <w:r>
+        <w:rPr>
+          <w:rFonts w:eastAsia="SimSun"/>
+        </w:rPr>
+        <w:t xml:space="preserve"> 三态渲染（倒计时大字 + 每孩完成卡 + 奖牌排名），全部复用既有 </w:t>
+      </w:r>
+      <w:r>
+        <w:rPr>
+          <w:rFonts w:ascii="Courier New" w:hAnsi="Courier New" w:eastAsia="SimSun"/>
+        </w:rPr>
+        <w:t>.btn</w:t>
+      </w:r>
+      <w:r>
+        <w:rPr>
+          <w:rFonts w:eastAsia="SimSun"/>
+        </w:rPr>
+        <w:t>/</w:t>
+      </w:r>
+      <w:r>
+        <w:rPr>
+          <w:rFonts w:ascii="Courier New" w:hAnsi="Courier New" w:eastAsia="SimSun"/>
+        </w:rPr>
+        <w:t>.stat-card</w:t>
+      </w:r>
+      <w:r>
+        <w:rPr>
+          <w:rFonts w:eastAsia="SimSun"/>
+        </w:rPr>
+        <w:t>/</w:t>
+      </w:r>
+      <w:r>
+        <w:rPr>
+          <w:rFonts w:ascii="Courier New" w:hAnsi="Courier New" w:eastAsia="SimSun"/>
+        </w:rPr>
+        <w:t>.hint</w:t>
+      </w:r>
+      <w:r>
+        <w:rPr>
+          <w:rFonts w:eastAsia="SimSun"/>
+        </w:rPr>
+        <w:t>、零新增 CSS；</w:t>
+      </w:r>
+      <w:r>
+        <w:rPr>
+          <w:rFonts w:ascii="Courier New" w:hAnsi="Courier New" w:eastAsia="SimSun"/>
+        </w:rPr>
+        <w:t>closeRaceDialog</w:t>
+      </w:r>
+      <w:r>
+        <w:rPr>
+          <w:rFonts w:eastAsia="SimSun"/>
+        </w:rPr>
+        <w:t xml:space="preserve"> 关闭即放弃当前局并停表。功能规格 FR-01~FR-24 不变，回归 </w:t>
+      </w:r>
+      <w:r>
+        <w:rPr>
+          <w:rFonts w:ascii="Courier New" w:hAnsi="Courier New" w:eastAsia="SimSun"/>
+        </w:rPr>
+        <w:t>verify_dom_stub.js</w:t>
+      </w:r>
+      <w:r>
+        <w:rPr>
+          <w:rFonts w:eastAsia="SimSun"/>
+        </w:rPr>
+        <w:t xml:space="preserve"> 新增 T60（设置/开始/完成/排名/奖励/个人最佳）、T61（计时结束仅奖励完成者）、T62（个人最佳更快则刷新）、T63（渲染/打开/关闭非浏览器安全）、T64（时长锁定 + 空参赛保护）、T65（接口暴露可达），最终 </w:t>
+      </w:r>
+      <w:r>
+        <w:rPr>
+          <w:rFonts w:eastAsia="SimSun"/>
+          <w:b/>
+        </w:rPr>
+        <w:t>323 passed / 0 failed</w:t>
+      </w:r>
+      <w:r>
+        <w:rPr>
+          <w:rFonts w:eastAsia="SimSun"/>
+        </w:rPr>
+        <w:t>。</w:t>
       </w:r>
     </w:p>
     <w:p>

</xml_diff>